<commit_message>
Detalle de funcionalidades del problema
</commit_message>
<xml_diff>
--- a/Documentacion/analisis.docx
+++ b/Documentacion/analisis.docx
@@ -58,6 +58,7 @@
           <w:ilvl w:val="0"/>
           <w:numId w:val="1"/>
         </w:numPr>
+        <w:spacing w:after="0"/>
       </w:pPr>
       <w:r>
         <w:t>Tener las tareas organizadas en un solo lugar.</w:t>
@@ -69,6 +70,7 @@
           <w:ilvl w:val="0"/>
           <w:numId w:val="1"/>
         </w:numPr>
+        <w:spacing w:after="0"/>
       </w:pPr>
       <w:r>
         <w:t>Registrar nuevas tareas y consultar las que ya existen.</w:t>
@@ -80,6 +82,7 @@
           <w:ilvl w:val="0"/>
           <w:numId w:val="1"/>
         </w:numPr>
+        <w:spacing w:after="0"/>
       </w:pPr>
       <w:r>
         <w:t>Modificar o eliminar una tarea cuando sea necesario.</w:t>
@@ -91,6 +94,7 @@
           <w:ilvl w:val="0"/>
           <w:numId w:val="1"/>
         </w:numPr>
+        <w:spacing w:after="0"/>
       </w:pPr>
       <w:r>
         <w:t>Facilitar a los estudiantes la consulta de las tareas asignadas.</w:t>
@@ -102,6 +106,7 @@
           <w:ilvl w:val="0"/>
           <w:numId w:val="1"/>
         </w:numPr>
+        <w:spacing w:after="0"/>
       </w:pPr>
       <w:r>
         <w:t>Mantener la información de los usuarios organizada.</w:t>
@@ -113,6 +118,7 @@
           <w:ilvl w:val="0"/>
           <w:numId w:val="1"/>
         </w:numPr>
+        <w:spacing w:after="0"/>
       </w:pPr>
       <w:r>
         <w:t>Permitir que cada usuario pueda iniciar sesión y administrar su información.</w:t>
@@ -124,12 +130,154 @@
           <w:ilvl w:val="0"/>
           <w:numId w:val="1"/>
         </w:numPr>
+        <w:spacing w:after="0"/>
       </w:pPr>
       <w:r>
         <w:t>Facilitar el seguimiento de las actividades académicas.</w:t>
       </w:r>
     </w:p>
     <w:p/>
+    <w:p>
+      <w:pPr>
+        <w:rPr>
+          <w:b/>
+          <w:bCs/>
+        </w:rPr>
+      </w:pPr>
+      <w:r>
+        <w:rPr>
+          <w:b/>
+          <w:bCs/>
+        </w:rPr>
+        <w:t>3. Funcionalidades principales del sistema</w:t>
+      </w:r>
+    </w:p>
+    <w:p>
+      <w:r>
+        <w:t>A partir de las necesidades identificadas y de los requerimientos planteados para el proyecto, se establecen las principales funciones que deberá realizar el sistema:</w:t>
+      </w:r>
+    </w:p>
+    <w:p>
+      <w:pPr>
+        <w:numPr>
+          <w:ilvl w:val="0"/>
+          <w:numId w:val="2"/>
+        </w:numPr>
+        <w:spacing w:after="0"/>
+      </w:pPr>
+      <w:r>
+        <w:t>El sistema debe permitir registrar nuevos usuarios.</w:t>
+      </w:r>
+    </w:p>
+    <w:p>
+      <w:pPr>
+        <w:numPr>
+          <w:ilvl w:val="0"/>
+          <w:numId w:val="2"/>
+        </w:numPr>
+        <w:spacing w:after="0"/>
+      </w:pPr>
+      <w:r>
+        <w:t>Debe permitir iniciar y cerrar sesión.</w:t>
+      </w:r>
+    </w:p>
+    <w:p>
+      <w:pPr>
+        <w:numPr>
+          <w:ilvl w:val="0"/>
+          <w:numId w:val="2"/>
+        </w:numPr>
+        <w:spacing w:after="0"/>
+      </w:pPr>
+      <w:r>
+        <w:t>Los usuarios deben poder consultar y modificar su información personal.</w:t>
+      </w:r>
+    </w:p>
+    <w:p>
+      <w:pPr>
+        <w:numPr>
+          <w:ilvl w:val="0"/>
+          <w:numId w:val="2"/>
+        </w:numPr>
+        <w:spacing w:after="0"/>
+      </w:pPr>
+      <w:r>
+        <w:t>Los usuarios autorizados deben poder administrar las cuentas de otros usuarios.</w:t>
+      </w:r>
+    </w:p>
+    <w:p>
+      <w:pPr>
+        <w:numPr>
+          <w:ilvl w:val="0"/>
+          <w:numId w:val="2"/>
+        </w:numPr>
+        <w:spacing w:after="0"/>
+      </w:pPr>
+      <w:r>
+        <w:t>La docente debe poder crear nuevas tareas.</w:t>
+      </w:r>
+    </w:p>
+    <w:p>
+      <w:pPr>
+        <w:numPr>
+          <w:ilvl w:val="0"/>
+          <w:numId w:val="2"/>
+        </w:numPr>
+        <w:spacing w:after="0"/>
+      </w:pPr>
+      <w:r>
+        <w:t>El sistema debe permitir consultar las tareas registradas.</w:t>
+      </w:r>
+    </w:p>
+    <w:p>
+      <w:pPr>
+        <w:numPr>
+          <w:ilvl w:val="0"/>
+          <w:numId w:val="2"/>
+        </w:numPr>
+        <w:spacing w:after="0"/>
+      </w:pPr>
+      <w:r>
+        <w:t>Debe permitir modificar la información de una tarea.</w:t>
+      </w:r>
+    </w:p>
+    <w:p>
+      <w:pPr>
+        <w:numPr>
+          <w:ilvl w:val="0"/>
+          <w:numId w:val="2"/>
+        </w:numPr>
+        <w:spacing w:after="0"/>
+      </w:pPr>
+      <w:r>
+        <w:lastRenderedPageBreak/>
+        <w:t>Debe permitir eliminar una tarea cuando sea necesario.</w:t>
+      </w:r>
+    </w:p>
+    <w:p>
+      <w:pPr>
+        <w:numPr>
+          <w:ilvl w:val="0"/>
+          <w:numId w:val="2"/>
+        </w:numPr>
+        <w:spacing w:after="0"/>
+      </w:pPr>
+      <w:r>
+        <w:t>El sistema debe permitir buscar tareas para facilitar su consulta.</w:t>
+      </w:r>
+    </w:p>
+    <w:p>
+      <w:pPr>
+        <w:numPr>
+          <w:ilvl w:val="0"/>
+          <w:numId w:val="2"/>
+        </w:numPr>
+        <w:spacing w:after="0"/>
+      </w:pPr>
+      <w:r>
+        <w:t>El sistema debe validar la información ingresada por los usuarios.</w:t>
+      </w:r>
+    </w:p>
     <w:p/>
     <w:sectPr>
       <w:pgSz w:w="12240" w:h="15840"/>
@@ -144,9 +292,9 @@
 <file path=word/numbering.xml><?xml version="1.0" encoding="utf-8"?>
 <w:numbering xmlns:wpc="http://schemas.microsoft.com/office/word/2010/wordprocessingCanvas" xmlns:cx="http://schemas.microsoft.com/office/drawing/2014/chartex" xmlns:cx1="http://schemas.microsoft.com/office/drawing/2015/9/8/chartex" xmlns:cx2="http://schemas.microsoft.com/office/drawing/2015/10/21/chartex" xmlns:cx3="http://schemas.microsoft.com/office/drawing/2016/5/9/chartex" xmlns:cx4="http://schemas.microsoft.com/office/drawing/2016/5/10/chartex" xmlns:cx5="http://schemas.microsoft.com/office/drawing/2016/5/11/chartex" xmlns:cx6="http://schemas.microsoft.com/office/drawing/2016/5/12/chartex" xmlns:cx7="http://schemas.microsoft.com/office/drawing/2016/5/13/chartex" xmlns:cx8="http://schemas.microsoft.com/office/drawing/2016/5/14/chartex" xmlns:mc="http://schemas.openxmlformats.org/markup-compatibility/2006" xmlns:aink="http://schemas.microsoft.com/office/drawing/2016/ink" xmlns:am3d="http://schemas.microsoft.com/office/drawing/2017/model3d" xmlns:o="urn:schemas-microsoft-com:office:office" xmlns:oel="http://schemas.microsoft.com/office/2019/extlst" xmlns:r="http://schemas.openxmlformats.org/officeDocument/2006/relationships" xmlns:m="http://schemas.openxmlformats.org/officeDocument/2006/math" xmlns:v="urn:schemas-microsoft-com:vml" xmlns:wp14="http://schemas.microsoft.com/office/word/2010/wordprocessingDrawing" xmlns:wp="http://schemas.openxmlformats.org/drawingml/2006/wordprocessingDrawing" xmlns:w10="urn:schemas-microsoft-com:office:word" xmlns:w="http://schemas.openxmlformats.org/wordprocessingml/2006/main" xmlns:w14="http://schemas.microsoft.com/office/word/2010/wordml" xmlns:w15="http://schemas.microsoft.com/office/word/2012/wordml" xmlns:w16cex="http://schemas.microsoft.com/office/word/2018/wordml/cex" xmlns:w16cid="http://schemas.microsoft.com/office/word/2016/wordml/cid" xmlns:w16="http://schemas.microsoft.com/office/word/2018/wordml" xmlns:w16du="http://schemas.microsoft.com/office/word/2023/wordml/word16du" xmlns:w16sdtdh="http://schemas.microsoft.com/office/word/2020/wordml/sdtdatahash" xmlns:w16sdtfl="http://schemas.microsoft.com/office/word/2024/wordml/sdtformatlock" xmlns:w16se="http://schemas.microsoft.com/office/word/2015/wordml/symex" xmlns:wpg="http://schemas.microsoft.com/office/word/2010/wordprocessingGroup" xmlns:wpi="http://schemas.microsoft.com/office/word/2010/wordprocessingInk" xmlns:wne="http://schemas.microsoft.com/office/word/2006/wordml" xmlns:wps="http://schemas.microsoft.com/office/word/2010/wordprocessingShape" mc:Ignorable="w14 w15 w16se w16cid w16 w16cex w16sdtdh w16sdtfl w16du wp14">
   <w:abstractNum w:abstractNumId="0" w15:restartNumberingAfterBreak="0">
-    <w:nsid w:val="6A760C14"/>
+    <w:nsid w:val="22070E49"/>
     <w:multiLevelType w:val="multilevel"/>
-    <w:tmpl w:val="19DC4C68"/>
+    <w:tmpl w:val="6E2ABB56"/>
     <w:lvl w:ilvl="0">
       <w:start w:val="1"/>
       <w:numFmt w:val="bullet"/>
@@ -292,7 +440,159 @@
       </w:rPr>
     </w:lvl>
   </w:abstractNum>
+  <w:abstractNum w:abstractNumId="1" w15:restartNumberingAfterBreak="0">
+    <w:nsid w:val="6A760C14"/>
+    <w:multiLevelType w:val="multilevel"/>
+    <w:tmpl w:val="19DC4C68"/>
+    <w:lvl w:ilvl="0">
+      <w:start w:val="1"/>
+      <w:numFmt w:val="bullet"/>
+      <w:lvlText w:val=""/>
+      <w:lvlJc w:val="left"/>
+      <w:pPr>
+        <w:tabs>
+          <w:tab w:val="num" w:pos="720"/>
+        </w:tabs>
+        <w:ind w:left="720" w:hanging="360"/>
+      </w:pPr>
+      <w:rPr>
+        <w:rFonts w:ascii="Symbol" w:hAnsi="Symbol" w:hint="default"/>
+        <w:sz w:val="20"/>
+      </w:rPr>
+    </w:lvl>
+    <w:lvl w:ilvl="1" w:tentative="1">
+      <w:start w:val="1"/>
+      <w:numFmt w:val="bullet"/>
+      <w:lvlText w:val="o"/>
+      <w:lvlJc w:val="left"/>
+      <w:pPr>
+        <w:tabs>
+          <w:tab w:val="num" w:pos="1440"/>
+        </w:tabs>
+        <w:ind w:left="1440" w:hanging="360"/>
+      </w:pPr>
+      <w:rPr>
+        <w:rFonts w:ascii="Courier New" w:hAnsi="Courier New" w:hint="default"/>
+        <w:sz w:val="20"/>
+      </w:rPr>
+    </w:lvl>
+    <w:lvl w:ilvl="2" w:tentative="1">
+      <w:start w:val="1"/>
+      <w:numFmt w:val="bullet"/>
+      <w:lvlText w:val=""/>
+      <w:lvlJc w:val="left"/>
+      <w:pPr>
+        <w:tabs>
+          <w:tab w:val="num" w:pos="2160"/>
+        </w:tabs>
+        <w:ind w:left="2160" w:hanging="360"/>
+      </w:pPr>
+      <w:rPr>
+        <w:rFonts w:ascii="Wingdings" w:hAnsi="Wingdings" w:hint="default"/>
+        <w:sz w:val="20"/>
+      </w:rPr>
+    </w:lvl>
+    <w:lvl w:ilvl="3" w:tentative="1">
+      <w:start w:val="1"/>
+      <w:numFmt w:val="bullet"/>
+      <w:lvlText w:val=""/>
+      <w:lvlJc w:val="left"/>
+      <w:pPr>
+        <w:tabs>
+          <w:tab w:val="num" w:pos="2880"/>
+        </w:tabs>
+        <w:ind w:left="2880" w:hanging="360"/>
+      </w:pPr>
+      <w:rPr>
+        <w:rFonts w:ascii="Wingdings" w:hAnsi="Wingdings" w:hint="default"/>
+        <w:sz w:val="20"/>
+      </w:rPr>
+    </w:lvl>
+    <w:lvl w:ilvl="4" w:tentative="1">
+      <w:start w:val="1"/>
+      <w:numFmt w:val="bullet"/>
+      <w:lvlText w:val=""/>
+      <w:lvlJc w:val="left"/>
+      <w:pPr>
+        <w:tabs>
+          <w:tab w:val="num" w:pos="3600"/>
+        </w:tabs>
+        <w:ind w:left="3600" w:hanging="360"/>
+      </w:pPr>
+      <w:rPr>
+        <w:rFonts w:ascii="Wingdings" w:hAnsi="Wingdings" w:hint="default"/>
+        <w:sz w:val="20"/>
+      </w:rPr>
+    </w:lvl>
+    <w:lvl w:ilvl="5" w:tentative="1">
+      <w:start w:val="1"/>
+      <w:numFmt w:val="bullet"/>
+      <w:lvlText w:val=""/>
+      <w:lvlJc w:val="left"/>
+      <w:pPr>
+        <w:tabs>
+          <w:tab w:val="num" w:pos="4320"/>
+        </w:tabs>
+        <w:ind w:left="4320" w:hanging="360"/>
+      </w:pPr>
+      <w:rPr>
+        <w:rFonts w:ascii="Wingdings" w:hAnsi="Wingdings" w:hint="default"/>
+        <w:sz w:val="20"/>
+      </w:rPr>
+    </w:lvl>
+    <w:lvl w:ilvl="6" w:tentative="1">
+      <w:start w:val="1"/>
+      <w:numFmt w:val="bullet"/>
+      <w:lvlText w:val=""/>
+      <w:lvlJc w:val="left"/>
+      <w:pPr>
+        <w:tabs>
+          <w:tab w:val="num" w:pos="5040"/>
+        </w:tabs>
+        <w:ind w:left="5040" w:hanging="360"/>
+      </w:pPr>
+      <w:rPr>
+        <w:rFonts w:ascii="Wingdings" w:hAnsi="Wingdings" w:hint="default"/>
+        <w:sz w:val="20"/>
+      </w:rPr>
+    </w:lvl>
+    <w:lvl w:ilvl="7" w:tentative="1">
+      <w:start w:val="1"/>
+      <w:numFmt w:val="bullet"/>
+      <w:lvlText w:val=""/>
+      <w:lvlJc w:val="left"/>
+      <w:pPr>
+        <w:tabs>
+          <w:tab w:val="num" w:pos="5760"/>
+        </w:tabs>
+        <w:ind w:left="5760" w:hanging="360"/>
+      </w:pPr>
+      <w:rPr>
+        <w:rFonts w:ascii="Wingdings" w:hAnsi="Wingdings" w:hint="default"/>
+        <w:sz w:val="20"/>
+      </w:rPr>
+    </w:lvl>
+    <w:lvl w:ilvl="8" w:tentative="1">
+      <w:start w:val="1"/>
+      <w:numFmt w:val="bullet"/>
+      <w:lvlText w:val=""/>
+      <w:lvlJc w:val="left"/>
+      <w:pPr>
+        <w:tabs>
+          <w:tab w:val="num" w:pos="6480"/>
+        </w:tabs>
+        <w:ind w:left="6480" w:hanging="360"/>
+      </w:pPr>
+      <w:rPr>
+        <w:rFonts w:ascii="Wingdings" w:hAnsi="Wingdings" w:hint="default"/>
+        <w:sz w:val="20"/>
+      </w:rPr>
+    </w:lvl>
+  </w:abstractNum>
   <w:num w:numId="1" w16cid:durableId="1669286953">
+    <w:abstractNumId w:val="1"/>
+  </w:num>
+  <w:num w:numId="2" w16cid:durableId="1133400485">
     <w:abstractNumId w:val="0"/>
   </w:num>
 </w:numbering>

</xml_diff>

<commit_message>
caracteristicas del sistema e identificón de actores
</commit_message>
<xml_diff>
--- a/Documentacion/analisis.docx
+++ b/Documentacion/analisis.docx
@@ -5,12 +5,14 @@
     <w:p>
       <w:pPr>
         <w:rPr>
+          <w:rFonts w:ascii="Arial" w:hAnsi="Arial" w:cs="Arial"/>
           <w:b/>
           <w:bCs/>
         </w:rPr>
       </w:pPr>
       <w:r>
         <w:rPr>
+          <w:rFonts w:ascii="Arial" w:hAnsi="Arial" w:cs="Arial"/>
           <w:b/>
           <w:bCs/>
         </w:rPr>
@@ -18,29 +20,55 @@
       </w:r>
     </w:p>
     <w:p>
-      <w:r>
+      <w:pPr>
+        <w:rPr>
+          <w:rFonts w:ascii="Arial" w:hAnsi="Arial" w:cs="Arial"/>
+        </w:rPr>
+      </w:pPr>
+      <w:r>
+        <w:rPr>
+          <w:rFonts w:ascii="Arial" w:hAnsi="Arial" w:cs="Arial"/>
+        </w:rPr>
         <w:t>La profesora Margarita actualmente organiza las tareas, clases y evaluaciones mediante cuadernos, hojas sueltas y aplicaciones personales, lo que dificulta llevar un control adecuado de las actividades académicas.</w:t>
       </w:r>
     </w:p>
     <w:p>
-      <w:r>
+      <w:pPr>
+        <w:rPr>
+          <w:rFonts w:ascii="Arial" w:hAnsi="Arial" w:cs="Arial"/>
+        </w:rPr>
+      </w:pPr>
+      <w:r>
+        <w:rPr>
+          <w:rFonts w:ascii="Arial" w:hAnsi="Arial" w:cs="Arial"/>
+        </w:rPr>
         <w:t>Esta situación puede provocar olvidos, retrasos en la entrega de tareas, duplicidad de trabajos y una distribución poco equilibrada de la carga académica de los estudiantes. Además, dificulta el seguimiento de las actividades por parte de la docente.</w:t>
       </w:r>
     </w:p>
     <w:p>
-      <w:r>
+      <w:pPr>
+        <w:rPr>
+          <w:rFonts w:ascii="Arial" w:hAnsi="Arial" w:cs="Arial"/>
+        </w:rPr>
+      </w:pPr>
+      <w:r>
+        <w:rPr>
+          <w:rFonts w:ascii="Arial" w:hAnsi="Arial" w:cs="Arial"/>
+        </w:rPr>
         <w:t>Por esta razón, se requiere un sistema web organizador de tareas escolares que permita centralizar la información, facilitar la planificación y mejorar el seguimiento de las actividades académicas.</w:t>
       </w:r>
     </w:p>
     <w:p>
       <w:pPr>
         <w:rPr>
+          <w:rFonts w:ascii="Arial" w:hAnsi="Arial" w:cs="Arial"/>
           <w:b/>
           <w:bCs/>
         </w:rPr>
       </w:pPr>
       <w:r>
         <w:rPr>
+          <w:rFonts w:ascii="Arial" w:hAnsi="Arial" w:cs="Arial"/>
           <w:b/>
           <w:bCs/>
         </w:rPr>
@@ -48,7 +76,15 @@
       </w:r>
     </w:p>
     <w:p>
-      <w:r>
+      <w:pPr>
+        <w:rPr>
+          <w:rFonts w:ascii="Arial" w:hAnsi="Arial" w:cs="Arial"/>
+        </w:rPr>
+      </w:pPr>
+      <w:r>
+        <w:rPr>
+          <w:rFonts w:ascii="Arial" w:hAnsi="Arial" w:cs="Arial"/>
+        </w:rPr>
         <w:t>Al analizar la situación planteada, se puede observar que la profesora necesita una forma más sencilla de organizar y controlar las actividades que asigna a sus estudiantes. Por ello, el sistema debe permitir:</w:t>
       </w:r>
     </w:p>
@@ -59,8 +95,14 @@
           <w:numId w:val="1"/>
         </w:numPr>
         <w:spacing w:after="0"/>
-      </w:pPr>
-      <w:r>
+        <w:rPr>
+          <w:rFonts w:ascii="Arial" w:hAnsi="Arial" w:cs="Arial"/>
+        </w:rPr>
+      </w:pPr>
+      <w:r>
+        <w:rPr>
+          <w:rFonts w:ascii="Arial" w:hAnsi="Arial" w:cs="Arial"/>
+        </w:rPr>
         <w:t>Tener las tareas organizadas en un solo lugar.</w:t>
       </w:r>
     </w:p>
@@ -71,8 +113,14 @@
           <w:numId w:val="1"/>
         </w:numPr>
         <w:spacing w:after="0"/>
-      </w:pPr>
-      <w:r>
+        <w:rPr>
+          <w:rFonts w:ascii="Arial" w:hAnsi="Arial" w:cs="Arial"/>
+        </w:rPr>
+      </w:pPr>
+      <w:r>
+        <w:rPr>
+          <w:rFonts w:ascii="Arial" w:hAnsi="Arial" w:cs="Arial"/>
+        </w:rPr>
         <w:t>Registrar nuevas tareas y consultar las que ya existen.</w:t>
       </w:r>
     </w:p>
@@ -83,8 +131,14 @@
           <w:numId w:val="1"/>
         </w:numPr>
         <w:spacing w:after="0"/>
-      </w:pPr>
-      <w:r>
+        <w:rPr>
+          <w:rFonts w:ascii="Arial" w:hAnsi="Arial" w:cs="Arial"/>
+        </w:rPr>
+      </w:pPr>
+      <w:r>
+        <w:rPr>
+          <w:rFonts w:ascii="Arial" w:hAnsi="Arial" w:cs="Arial"/>
+        </w:rPr>
         <w:t>Modificar o eliminar una tarea cuando sea necesario.</w:t>
       </w:r>
     </w:p>
@@ -95,8 +149,14 @@
           <w:numId w:val="1"/>
         </w:numPr>
         <w:spacing w:after="0"/>
-      </w:pPr>
-      <w:r>
+        <w:rPr>
+          <w:rFonts w:ascii="Arial" w:hAnsi="Arial" w:cs="Arial"/>
+        </w:rPr>
+      </w:pPr>
+      <w:r>
+        <w:rPr>
+          <w:rFonts w:ascii="Arial" w:hAnsi="Arial" w:cs="Arial"/>
+        </w:rPr>
         <w:t>Facilitar a los estudiantes la consulta de las tareas asignadas.</w:t>
       </w:r>
     </w:p>
@@ -107,8 +167,14 @@
           <w:numId w:val="1"/>
         </w:numPr>
         <w:spacing w:after="0"/>
-      </w:pPr>
-      <w:r>
+        <w:rPr>
+          <w:rFonts w:ascii="Arial" w:hAnsi="Arial" w:cs="Arial"/>
+        </w:rPr>
+      </w:pPr>
+      <w:r>
+        <w:rPr>
+          <w:rFonts w:ascii="Arial" w:hAnsi="Arial" w:cs="Arial"/>
+        </w:rPr>
         <w:t>Mantener la información de los usuarios organizada.</w:t>
       </w:r>
     </w:p>
@@ -119,8 +185,14 @@
           <w:numId w:val="1"/>
         </w:numPr>
         <w:spacing w:after="0"/>
-      </w:pPr>
-      <w:r>
+        <w:rPr>
+          <w:rFonts w:ascii="Arial" w:hAnsi="Arial" w:cs="Arial"/>
+        </w:rPr>
+      </w:pPr>
+      <w:r>
+        <w:rPr>
+          <w:rFonts w:ascii="Arial" w:hAnsi="Arial" w:cs="Arial"/>
+        </w:rPr>
         <w:t>Permitir que cada usuario pueda iniciar sesión y administrar su información.</w:t>
       </w:r>
     </w:p>
@@ -131,21 +203,35 @@
           <w:numId w:val="1"/>
         </w:numPr>
         <w:spacing w:after="0"/>
-      </w:pPr>
-      <w:r>
+        <w:rPr>
+          <w:rFonts w:ascii="Arial" w:hAnsi="Arial" w:cs="Arial"/>
+        </w:rPr>
+      </w:pPr>
+      <w:r>
+        <w:rPr>
+          <w:rFonts w:ascii="Arial" w:hAnsi="Arial" w:cs="Arial"/>
+        </w:rPr>
         <w:t>Facilitar el seguimiento de las actividades académicas.</w:t>
       </w:r>
     </w:p>
-    <w:p/>
-    <w:p>
-      <w:pPr>
-        <w:rPr>
+    <w:p>
+      <w:pPr>
+        <w:rPr>
+          <w:rFonts w:ascii="Arial" w:hAnsi="Arial" w:cs="Arial"/>
+        </w:rPr>
+      </w:pPr>
+    </w:p>
+    <w:p>
+      <w:pPr>
+        <w:rPr>
+          <w:rFonts w:ascii="Arial" w:hAnsi="Arial" w:cs="Arial"/>
           <w:b/>
           <w:bCs/>
         </w:rPr>
       </w:pPr>
       <w:r>
         <w:rPr>
+          <w:rFonts w:ascii="Arial" w:hAnsi="Arial" w:cs="Arial"/>
           <w:b/>
           <w:bCs/>
         </w:rPr>
@@ -153,7 +239,15 @@
       </w:r>
     </w:p>
     <w:p>
-      <w:r>
+      <w:pPr>
+        <w:rPr>
+          <w:rFonts w:ascii="Arial" w:hAnsi="Arial" w:cs="Arial"/>
+        </w:rPr>
+      </w:pPr>
+      <w:r>
+        <w:rPr>
+          <w:rFonts w:ascii="Arial" w:hAnsi="Arial" w:cs="Arial"/>
+        </w:rPr>
         <w:t>A partir de las necesidades identificadas y de los requerimientos planteados para el proyecto, se establecen las principales funciones que deberá realizar el sistema:</w:t>
       </w:r>
     </w:p>
@@ -164,8 +258,14 @@
           <w:numId w:val="2"/>
         </w:numPr>
         <w:spacing w:after="0"/>
-      </w:pPr>
-      <w:r>
+        <w:rPr>
+          <w:rFonts w:ascii="Arial" w:hAnsi="Arial" w:cs="Arial"/>
+        </w:rPr>
+      </w:pPr>
+      <w:r>
+        <w:rPr>
+          <w:rFonts w:ascii="Arial" w:hAnsi="Arial" w:cs="Arial"/>
+        </w:rPr>
         <w:t>El sistema debe permitir registrar nuevos usuarios.</w:t>
       </w:r>
     </w:p>
@@ -176,8 +276,14 @@
           <w:numId w:val="2"/>
         </w:numPr>
         <w:spacing w:after="0"/>
-      </w:pPr>
-      <w:r>
+        <w:rPr>
+          <w:rFonts w:ascii="Arial" w:hAnsi="Arial" w:cs="Arial"/>
+        </w:rPr>
+      </w:pPr>
+      <w:r>
+        <w:rPr>
+          <w:rFonts w:ascii="Arial" w:hAnsi="Arial" w:cs="Arial"/>
+        </w:rPr>
         <w:t>Debe permitir iniciar y cerrar sesión.</w:t>
       </w:r>
     </w:p>
@@ -188,8 +294,14 @@
           <w:numId w:val="2"/>
         </w:numPr>
         <w:spacing w:after="0"/>
-      </w:pPr>
-      <w:r>
+        <w:rPr>
+          <w:rFonts w:ascii="Arial" w:hAnsi="Arial" w:cs="Arial"/>
+        </w:rPr>
+      </w:pPr>
+      <w:r>
+        <w:rPr>
+          <w:rFonts w:ascii="Arial" w:hAnsi="Arial" w:cs="Arial"/>
+        </w:rPr>
         <w:t>Los usuarios deben poder consultar y modificar su información personal.</w:t>
       </w:r>
     </w:p>
@@ -200,8 +312,14 @@
           <w:numId w:val="2"/>
         </w:numPr>
         <w:spacing w:after="0"/>
-      </w:pPr>
-      <w:r>
+        <w:rPr>
+          <w:rFonts w:ascii="Arial" w:hAnsi="Arial" w:cs="Arial"/>
+        </w:rPr>
+      </w:pPr>
+      <w:r>
+        <w:rPr>
+          <w:rFonts w:ascii="Arial" w:hAnsi="Arial" w:cs="Arial"/>
+        </w:rPr>
         <w:t>Los usuarios autorizados deben poder administrar las cuentas de otros usuarios.</w:t>
       </w:r>
     </w:p>
@@ -212,8 +330,14 @@
           <w:numId w:val="2"/>
         </w:numPr>
         <w:spacing w:after="0"/>
-      </w:pPr>
-      <w:r>
+        <w:rPr>
+          <w:rFonts w:ascii="Arial" w:hAnsi="Arial" w:cs="Arial"/>
+        </w:rPr>
+      </w:pPr>
+      <w:r>
+        <w:rPr>
+          <w:rFonts w:ascii="Arial" w:hAnsi="Arial" w:cs="Arial"/>
+        </w:rPr>
         <w:t>La docente debe poder crear nuevas tareas.</w:t>
       </w:r>
     </w:p>
@@ -224,8 +348,14 @@
           <w:numId w:val="2"/>
         </w:numPr>
         <w:spacing w:after="0"/>
-      </w:pPr>
-      <w:r>
+        <w:rPr>
+          <w:rFonts w:ascii="Arial" w:hAnsi="Arial" w:cs="Arial"/>
+        </w:rPr>
+      </w:pPr>
+      <w:r>
+        <w:rPr>
+          <w:rFonts w:ascii="Arial" w:hAnsi="Arial" w:cs="Arial"/>
+        </w:rPr>
         <w:t>El sistema debe permitir consultar las tareas registradas.</w:t>
       </w:r>
     </w:p>
@@ -236,8 +366,14 @@
           <w:numId w:val="2"/>
         </w:numPr>
         <w:spacing w:after="0"/>
-      </w:pPr>
-      <w:r>
+        <w:rPr>
+          <w:rFonts w:ascii="Arial" w:hAnsi="Arial" w:cs="Arial"/>
+        </w:rPr>
+      </w:pPr>
+      <w:r>
+        <w:rPr>
+          <w:rFonts w:ascii="Arial" w:hAnsi="Arial" w:cs="Arial"/>
+        </w:rPr>
         <w:t>Debe permitir modificar la información de una tarea.</w:t>
       </w:r>
     </w:p>
@@ -248,40 +384,350 @@
           <w:numId w:val="2"/>
         </w:numPr>
         <w:spacing w:after="0"/>
-      </w:pPr>
-      <w:r>
+        <w:rPr>
+          <w:rFonts w:ascii="Arial" w:hAnsi="Arial" w:cs="Arial"/>
+        </w:rPr>
+      </w:pPr>
+      <w:r>
+        <w:rPr>
+          <w:rFonts w:ascii="Arial" w:hAnsi="Arial" w:cs="Arial"/>
+        </w:rPr>
+        <w:t>Debe permitir eliminar una tarea cuando sea necesario.</w:t>
+      </w:r>
+    </w:p>
+    <w:p>
+      <w:pPr>
+        <w:numPr>
+          <w:ilvl w:val="0"/>
+          <w:numId w:val="2"/>
+        </w:numPr>
+        <w:spacing w:after="0"/>
+        <w:rPr>
+          <w:rFonts w:ascii="Arial" w:hAnsi="Arial" w:cs="Arial"/>
+        </w:rPr>
+      </w:pPr>
+      <w:r>
+        <w:rPr>
+          <w:rFonts w:ascii="Arial" w:hAnsi="Arial" w:cs="Arial"/>
+        </w:rPr>
+        <w:t>El sistema debe permitir buscar tareas para facilitar su consulta.</w:t>
+      </w:r>
+    </w:p>
+    <w:p>
+      <w:pPr>
+        <w:numPr>
+          <w:ilvl w:val="0"/>
+          <w:numId w:val="2"/>
+        </w:numPr>
+        <w:spacing w:after="0"/>
+        <w:rPr>
+          <w:rFonts w:ascii="Arial" w:hAnsi="Arial" w:cs="Arial"/>
+        </w:rPr>
+      </w:pPr>
+      <w:r>
+        <w:rPr>
+          <w:rFonts w:ascii="Arial" w:hAnsi="Arial" w:cs="Arial"/>
+        </w:rPr>
+        <w:t>El sistema debe validar la información ingresada por los usuarios.</w:t>
+      </w:r>
+    </w:p>
+    <w:p>
+      <w:pPr>
+        <w:numPr>
+          <w:ilvl w:val="0"/>
+          <w:numId w:val="2"/>
+        </w:numPr>
+        <w:spacing w:after="0"/>
+        <w:rPr>
+          <w:rFonts w:ascii="Arial" w:hAnsi="Arial" w:cs="Arial"/>
+        </w:rPr>
+      </w:pPr>
+    </w:p>
+    <w:p>
+      <w:pPr>
+        <w:spacing w:after="0"/>
+        <w:rPr>
+          <w:rFonts w:ascii="Arial" w:hAnsi="Arial" w:cs="Arial"/>
+          <w:b/>
+          <w:bCs/>
+        </w:rPr>
+      </w:pPr>
+      <w:r>
+        <w:rPr>
+          <w:rFonts w:ascii="Arial" w:hAnsi="Arial" w:cs="Arial"/>
+          <w:b/>
+          <w:bCs/>
+        </w:rPr>
+        <w:t>4. Características que debe cumplir el sistema</w:t>
+      </w:r>
+    </w:p>
+    <w:p>
+      <w:pPr>
+        <w:spacing w:after="0"/>
+        <w:rPr>
+          <w:rFonts w:ascii="Arial" w:hAnsi="Arial" w:cs="Arial"/>
+        </w:rPr>
+      </w:pPr>
+      <w:r>
+        <w:rPr>
+          <w:rFonts w:ascii="Arial" w:hAnsi="Arial" w:cs="Arial"/>
+        </w:rPr>
+        <w:t>Además de realizar las funciones principales, el sistema debe contar con características que permitan utilizarlo de forma segura, sencilla y confiable.</w:t>
+      </w:r>
+    </w:p>
+    <w:p>
+      <w:pPr>
+        <w:numPr>
+          <w:ilvl w:val="0"/>
+          <w:numId w:val="3"/>
+        </w:numPr>
+        <w:spacing w:after="0"/>
+        <w:rPr>
+          <w:rFonts w:ascii="Arial" w:hAnsi="Arial" w:cs="Arial"/>
+        </w:rPr>
+      </w:pPr>
+      <w:r>
+        <w:rPr>
+          <w:rFonts w:ascii="Arial" w:hAnsi="Arial" w:cs="Arial"/>
+        </w:rPr>
+        <w:t>Debe ser fácil de utilizar y permitir que los usuarios encuentren las opciones necesarias sin complicaciones.</w:t>
+      </w:r>
+    </w:p>
+    <w:p>
+      <w:pPr>
+        <w:numPr>
+          <w:ilvl w:val="0"/>
+          <w:numId w:val="3"/>
+        </w:numPr>
+        <w:spacing w:after="0"/>
+        <w:rPr>
+          <w:rFonts w:ascii="Arial" w:hAnsi="Arial" w:cs="Arial"/>
+        </w:rPr>
+      </w:pPr>
+      <w:r>
+        <w:rPr>
+          <w:rFonts w:ascii="Arial" w:hAnsi="Arial" w:cs="Arial"/>
+        </w:rPr>
         <w:lastRenderedPageBreak/>
-        <w:t>Debe permitir eliminar una tarea cuando sea necesario.</w:t>
-      </w:r>
-    </w:p>
-    <w:p>
-      <w:pPr>
-        <w:numPr>
-          <w:ilvl w:val="0"/>
-          <w:numId w:val="2"/>
-        </w:numPr>
-        <w:spacing w:after="0"/>
-      </w:pPr>
-      <w:r>
-        <w:t>El sistema debe permitir buscar tareas para facilitar su consulta.</w:t>
-      </w:r>
-    </w:p>
-    <w:p>
-      <w:pPr>
-        <w:numPr>
-          <w:ilvl w:val="0"/>
-          <w:numId w:val="2"/>
-        </w:numPr>
-        <w:spacing w:after="0"/>
-      </w:pPr>
-      <w:r>
-        <w:t>El sistema debe validar la información ingresada por los usuarios.</w:t>
-      </w:r>
-    </w:p>
-    <w:p/>
+        <w:t>La información de los usuarios debe mantenerse protegida mediante un sistema de inicio de sesión.</w:t>
+      </w:r>
+    </w:p>
+    <w:p>
+      <w:pPr>
+        <w:numPr>
+          <w:ilvl w:val="0"/>
+          <w:numId w:val="3"/>
+        </w:numPr>
+        <w:spacing w:after="0"/>
+        <w:rPr>
+          <w:rFonts w:ascii="Arial" w:hAnsi="Arial" w:cs="Arial"/>
+        </w:rPr>
+      </w:pPr>
+      <w:r>
+        <w:rPr>
+          <w:rFonts w:ascii="Arial" w:hAnsi="Arial" w:cs="Arial"/>
+        </w:rPr>
+        <w:t>Los datos ingresados deben ser validados para evitar información incorrecta o incompleta.</w:t>
+      </w:r>
+    </w:p>
+    <w:p>
+      <w:pPr>
+        <w:numPr>
+          <w:ilvl w:val="0"/>
+          <w:numId w:val="3"/>
+        </w:numPr>
+        <w:spacing w:after="0"/>
+        <w:rPr>
+          <w:rFonts w:ascii="Arial" w:hAnsi="Arial" w:cs="Arial"/>
+        </w:rPr>
+      </w:pPr>
+      <w:r>
+        <w:rPr>
+          <w:rFonts w:ascii="Arial" w:hAnsi="Arial" w:cs="Arial"/>
+        </w:rPr>
+        <w:t>El sistema debe mantener la información organizada y disponible para su consulta.</w:t>
+      </w:r>
+    </w:p>
+    <w:p>
+      <w:pPr>
+        <w:numPr>
+          <w:ilvl w:val="0"/>
+          <w:numId w:val="3"/>
+        </w:numPr>
+        <w:spacing w:after="0"/>
+        <w:rPr>
+          <w:rFonts w:ascii="Arial" w:hAnsi="Arial" w:cs="Arial"/>
+        </w:rPr>
+      </w:pPr>
+      <w:r>
+        <w:rPr>
+          <w:rFonts w:ascii="Arial" w:hAnsi="Arial" w:cs="Arial"/>
+        </w:rPr>
+        <w:t>Debe permitir que las acciones realizadas por cada usuario respeten los permisos que le correspondan.</w:t>
+      </w:r>
+    </w:p>
+    <w:p>
+      <w:pPr>
+        <w:numPr>
+          <w:ilvl w:val="0"/>
+          <w:numId w:val="3"/>
+        </w:numPr>
+        <w:spacing w:after="0"/>
+        <w:rPr>
+          <w:rFonts w:ascii="Arial" w:hAnsi="Arial" w:cs="Arial"/>
+        </w:rPr>
+      </w:pPr>
+      <w:r>
+        <w:rPr>
+          <w:rFonts w:ascii="Arial" w:hAnsi="Arial" w:cs="Arial"/>
+        </w:rPr>
+        <w:t>La aplicación debe funcionar correctamente desde un navegador web.</w:t>
+      </w:r>
+    </w:p>
+    <w:p>
+      <w:pPr>
+        <w:numPr>
+          <w:ilvl w:val="0"/>
+          <w:numId w:val="3"/>
+        </w:numPr>
+        <w:spacing w:after="0"/>
+        <w:rPr>
+          <w:rFonts w:ascii="Arial" w:hAnsi="Arial" w:cs="Arial"/>
+        </w:rPr>
+      </w:pPr>
+      <w:r>
+        <w:rPr>
+          <w:rFonts w:ascii="Arial" w:hAnsi="Arial" w:cs="Arial"/>
+        </w:rPr>
+        <w:t>La interfaz debe permitir el cambio entre español e inglés, de acuerdo con lo establecido en el proyecto.</w:t>
+      </w:r>
+    </w:p>
+    <w:p>
+      <w:pPr>
+        <w:spacing w:after="0"/>
+        <w:rPr>
+          <w:rFonts w:ascii="Arial" w:hAnsi="Arial" w:cs="Arial"/>
+        </w:rPr>
+      </w:pPr>
+    </w:p>
+    <w:p>
+      <w:pPr>
+        <w:rPr>
+          <w:rFonts w:ascii="Arial" w:hAnsi="Arial" w:cs="Arial"/>
+          <w:b/>
+          <w:bCs/>
+        </w:rPr>
+      </w:pPr>
+      <w:r>
+        <w:rPr>
+          <w:rFonts w:ascii="Arial" w:hAnsi="Arial" w:cs="Arial"/>
+          <w:b/>
+          <w:bCs/>
+        </w:rPr>
+        <w:t>5. Actores del sistema</w:t>
+      </w:r>
+    </w:p>
+    <w:p>
+      <w:pPr>
+        <w:rPr>
+          <w:rFonts w:ascii="Arial" w:hAnsi="Arial" w:cs="Arial"/>
+        </w:rPr>
+      </w:pPr>
+      <w:r>
+        <w:rPr>
+          <w:rFonts w:ascii="Arial" w:hAnsi="Arial" w:cs="Arial"/>
+        </w:rPr>
+        <w:t>Para el funcionamiento del sistema se identifican tres tipos de usuarios, cada uno con diferentes responsabilidades:</w:t>
+      </w:r>
+    </w:p>
+    <w:p>
+      <w:pPr>
+        <w:numPr>
+          <w:ilvl w:val="0"/>
+          <w:numId w:val="4"/>
+        </w:numPr>
+        <w:spacing w:after="0"/>
+        <w:rPr>
+          <w:rFonts w:ascii="Arial" w:hAnsi="Arial" w:cs="Arial"/>
+        </w:rPr>
+      </w:pPr>
+      <w:r>
+        <w:rPr>
+          <w:rFonts w:ascii="Arial" w:hAnsi="Arial" w:cs="Arial"/>
+          <w:b/>
+          <w:bCs/>
+        </w:rPr>
+        <w:t>Profesora:</w:t>
+      </w:r>
+      <w:r>
+        <w:rPr>
+          <w:rFonts w:ascii="Arial" w:hAnsi="Arial" w:cs="Arial"/>
+        </w:rPr>
+        <w:t xml:space="preserve"> se encarga principalmente de organizar y administrar las tareas que se asignan a los estudiantes.</w:t>
+      </w:r>
+    </w:p>
+    <w:p>
+      <w:pPr>
+        <w:numPr>
+          <w:ilvl w:val="0"/>
+          <w:numId w:val="4"/>
+        </w:numPr>
+        <w:spacing w:after="0"/>
+        <w:rPr>
+          <w:rFonts w:ascii="Arial" w:hAnsi="Arial" w:cs="Arial"/>
+        </w:rPr>
+      </w:pPr>
+      <w:r>
+        <w:rPr>
+          <w:rFonts w:ascii="Arial" w:hAnsi="Arial" w:cs="Arial"/>
+          <w:b/>
+          <w:bCs/>
+        </w:rPr>
+        <w:t>Estudiante:</w:t>
+      </w:r>
+      <w:r>
+        <w:rPr>
+          <w:rFonts w:ascii="Arial" w:hAnsi="Arial" w:cs="Arial"/>
+        </w:rPr>
+        <w:t xml:space="preserve"> utiliza el sistema para consultar las tareas y conocer las actividades que tiene pendientes.</w:t>
+      </w:r>
+    </w:p>
+    <w:p>
+      <w:pPr>
+        <w:numPr>
+          <w:ilvl w:val="0"/>
+          <w:numId w:val="4"/>
+        </w:numPr>
+        <w:spacing w:after="0"/>
+        <w:rPr>
+          <w:rFonts w:ascii="Arial" w:hAnsi="Arial" w:cs="Arial"/>
+        </w:rPr>
+      </w:pPr>
+      <w:r>
+        <w:rPr>
+          <w:rFonts w:ascii="Arial" w:hAnsi="Arial" w:cs="Arial"/>
+          <w:b/>
+          <w:bCs/>
+        </w:rPr>
+        <w:t>Administrador:</w:t>
+      </w:r>
+      <w:r>
+        <w:rPr>
+          <w:rFonts w:ascii="Arial" w:hAnsi="Arial" w:cs="Arial"/>
+        </w:rPr>
+        <w:t xml:space="preserve"> se encarga de la administración de los usuarios y de las opciones que requieren permisos especiales.</w:t>
+      </w:r>
+    </w:p>
+    <w:p>
+      <w:pPr>
+        <w:rPr>
+          <w:rFonts w:ascii="Arial" w:hAnsi="Arial" w:cs="Arial"/>
+        </w:rPr>
+      </w:pPr>
+    </w:p>
     <w:sectPr>
       <w:pgSz w:w="12240" w:h="15840"/>
-      <w:pgMar w:top="1417" w:right="1701" w:bottom="1417" w:left="1701" w:header="708" w:footer="708" w:gutter="0"/>
+      <w:pgMar w:top="720" w:right="720" w:bottom="720" w:left="720" w:header="708" w:footer="708" w:gutter="0"/>
       <w:cols w:space="708"/>
       <w:docGrid w:linePitch="360"/>
     </w:sectPr>
@@ -292,6 +738,155 @@
 <file path=word/numbering.xml><?xml version="1.0" encoding="utf-8"?>
 <w:numbering xmlns:wpc="http://schemas.microsoft.com/office/word/2010/wordprocessingCanvas" xmlns:cx="http://schemas.microsoft.com/office/drawing/2014/chartex" xmlns:cx1="http://schemas.microsoft.com/office/drawing/2015/9/8/chartex" xmlns:cx2="http://schemas.microsoft.com/office/drawing/2015/10/21/chartex" xmlns:cx3="http://schemas.microsoft.com/office/drawing/2016/5/9/chartex" xmlns:cx4="http://schemas.microsoft.com/office/drawing/2016/5/10/chartex" xmlns:cx5="http://schemas.microsoft.com/office/drawing/2016/5/11/chartex" xmlns:cx6="http://schemas.microsoft.com/office/drawing/2016/5/12/chartex" xmlns:cx7="http://schemas.microsoft.com/office/drawing/2016/5/13/chartex" xmlns:cx8="http://schemas.microsoft.com/office/drawing/2016/5/14/chartex" xmlns:mc="http://schemas.openxmlformats.org/markup-compatibility/2006" xmlns:aink="http://schemas.microsoft.com/office/drawing/2016/ink" xmlns:am3d="http://schemas.microsoft.com/office/drawing/2017/model3d" xmlns:o="urn:schemas-microsoft-com:office:office" xmlns:oel="http://schemas.microsoft.com/office/2019/extlst" xmlns:r="http://schemas.openxmlformats.org/officeDocument/2006/relationships" xmlns:m="http://schemas.openxmlformats.org/officeDocument/2006/math" xmlns:v="urn:schemas-microsoft-com:vml" xmlns:wp14="http://schemas.microsoft.com/office/word/2010/wordprocessingDrawing" xmlns:wp="http://schemas.openxmlformats.org/drawingml/2006/wordprocessingDrawing" xmlns:w10="urn:schemas-microsoft-com:office:word" xmlns:w="http://schemas.openxmlformats.org/wordprocessingml/2006/main" xmlns:w14="http://schemas.microsoft.com/office/word/2010/wordml" xmlns:w15="http://schemas.microsoft.com/office/word/2012/wordml" xmlns:w16cex="http://schemas.microsoft.com/office/word/2018/wordml/cex" xmlns:w16cid="http://schemas.microsoft.com/office/word/2016/wordml/cid" xmlns:w16="http://schemas.microsoft.com/office/word/2018/wordml" xmlns:w16du="http://schemas.microsoft.com/office/word/2023/wordml/word16du" xmlns:w16sdtdh="http://schemas.microsoft.com/office/word/2020/wordml/sdtdatahash" xmlns:w16sdtfl="http://schemas.microsoft.com/office/word/2024/wordml/sdtformatlock" xmlns:w16se="http://schemas.microsoft.com/office/word/2015/wordml/symex" xmlns:wpg="http://schemas.microsoft.com/office/word/2010/wordprocessingGroup" xmlns:wpi="http://schemas.microsoft.com/office/word/2010/wordprocessingInk" xmlns:wne="http://schemas.microsoft.com/office/word/2006/wordml" xmlns:wps="http://schemas.microsoft.com/office/word/2010/wordprocessingShape" mc:Ignorable="w14 w15 w16se w16cid w16 w16cex w16sdtdh w16sdtfl w16du wp14">
   <w:abstractNum w:abstractNumId="0" w15:restartNumberingAfterBreak="0">
+    <w:nsid w:val="0124672E"/>
+    <w:multiLevelType w:val="multilevel"/>
+    <w:tmpl w:val="3312BE14"/>
+    <w:lvl w:ilvl="0">
+      <w:start w:val="1"/>
+      <w:numFmt w:val="bullet"/>
+      <w:lvlText w:val=""/>
+      <w:lvlJc w:val="left"/>
+      <w:pPr>
+        <w:tabs>
+          <w:tab w:val="num" w:pos="720"/>
+        </w:tabs>
+        <w:ind w:left="720" w:hanging="360"/>
+      </w:pPr>
+      <w:rPr>
+        <w:rFonts w:ascii="Symbol" w:hAnsi="Symbol" w:hint="default"/>
+        <w:sz w:val="20"/>
+      </w:rPr>
+    </w:lvl>
+    <w:lvl w:ilvl="1" w:tentative="1">
+      <w:start w:val="1"/>
+      <w:numFmt w:val="bullet"/>
+      <w:lvlText w:val="o"/>
+      <w:lvlJc w:val="left"/>
+      <w:pPr>
+        <w:tabs>
+          <w:tab w:val="num" w:pos="1440"/>
+        </w:tabs>
+        <w:ind w:left="1440" w:hanging="360"/>
+      </w:pPr>
+      <w:rPr>
+        <w:rFonts w:ascii="Courier New" w:hAnsi="Courier New" w:hint="default"/>
+        <w:sz w:val="20"/>
+      </w:rPr>
+    </w:lvl>
+    <w:lvl w:ilvl="2" w:tentative="1">
+      <w:start w:val="1"/>
+      <w:numFmt w:val="bullet"/>
+      <w:lvlText w:val=""/>
+      <w:lvlJc w:val="left"/>
+      <w:pPr>
+        <w:tabs>
+          <w:tab w:val="num" w:pos="2160"/>
+        </w:tabs>
+        <w:ind w:left="2160" w:hanging="360"/>
+      </w:pPr>
+      <w:rPr>
+        <w:rFonts w:ascii="Wingdings" w:hAnsi="Wingdings" w:hint="default"/>
+        <w:sz w:val="20"/>
+      </w:rPr>
+    </w:lvl>
+    <w:lvl w:ilvl="3" w:tentative="1">
+      <w:start w:val="1"/>
+      <w:numFmt w:val="bullet"/>
+      <w:lvlText w:val=""/>
+      <w:lvlJc w:val="left"/>
+      <w:pPr>
+        <w:tabs>
+          <w:tab w:val="num" w:pos="2880"/>
+        </w:tabs>
+        <w:ind w:left="2880" w:hanging="360"/>
+      </w:pPr>
+      <w:rPr>
+        <w:rFonts w:ascii="Wingdings" w:hAnsi="Wingdings" w:hint="default"/>
+        <w:sz w:val="20"/>
+      </w:rPr>
+    </w:lvl>
+    <w:lvl w:ilvl="4" w:tentative="1">
+      <w:start w:val="1"/>
+      <w:numFmt w:val="bullet"/>
+      <w:lvlText w:val=""/>
+      <w:lvlJc w:val="left"/>
+      <w:pPr>
+        <w:tabs>
+          <w:tab w:val="num" w:pos="3600"/>
+        </w:tabs>
+        <w:ind w:left="3600" w:hanging="360"/>
+      </w:pPr>
+      <w:rPr>
+        <w:rFonts w:ascii="Wingdings" w:hAnsi="Wingdings" w:hint="default"/>
+        <w:sz w:val="20"/>
+      </w:rPr>
+    </w:lvl>
+    <w:lvl w:ilvl="5" w:tentative="1">
+      <w:start w:val="1"/>
+      <w:numFmt w:val="bullet"/>
+      <w:lvlText w:val=""/>
+      <w:lvlJc w:val="left"/>
+      <w:pPr>
+        <w:tabs>
+          <w:tab w:val="num" w:pos="4320"/>
+        </w:tabs>
+        <w:ind w:left="4320" w:hanging="360"/>
+      </w:pPr>
+      <w:rPr>
+        <w:rFonts w:ascii="Wingdings" w:hAnsi="Wingdings" w:hint="default"/>
+        <w:sz w:val="20"/>
+      </w:rPr>
+    </w:lvl>
+    <w:lvl w:ilvl="6" w:tentative="1">
+      <w:start w:val="1"/>
+      <w:numFmt w:val="bullet"/>
+      <w:lvlText w:val=""/>
+      <w:lvlJc w:val="left"/>
+      <w:pPr>
+        <w:tabs>
+          <w:tab w:val="num" w:pos="5040"/>
+        </w:tabs>
+        <w:ind w:left="5040" w:hanging="360"/>
+      </w:pPr>
+      <w:rPr>
+        <w:rFonts w:ascii="Wingdings" w:hAnsi="Wingdings" w:hint="default"/>
+        <w:sz w:val="20"/>
+      </w:rPr>
+    </w:lvl>
+    <w:lvl w:ilvl="7" w:tentative="1">
+      <w:start w:val="1"/>
+      <w:numFmt w:val="bullet"/>
+      <w:lvlText w:val=""/>
+      <w:lvlJc w:val="left"/>
+      <w:pPr>
+        <w:tabs>
+          <w:tab w:val="num" w:pos="5760"/>
+        </w:tabs>
+        <w:ind w:left="5760" w:hanging="360"/>
+      </w:pPr>
+      <w:rPr>
+        <w:rFonts w:ascii="Wingdings" w:hAnsi="Wingdings" w:hint="default"/>
+        <w:sz w:val="20"/>
+      </w:rPr>
+    </w:lvl>
+    <w:lvl w:ilvl="8" w:tentative="1">
+      <w:start w:val="1"/>
+      <w:numFmt w:val="bullet"/>
+      <w:lvlText w:val=""/>
+      <w:lvlJc w:val="left"/>
+      <w:pPr>
+        <w:tabs>
+          <w:tab w:val="num" w:pos="6480"/>
+        </w:tabs>
+        <w:ind w:left="6480" w:hanging="360"/>
+      </w:pPr>
+      <w:rPr>
+        <w:rFonts w:ascii="Wingdings" w:hAnsi="Wingdings" w:hint="default"/>
+        <w:sz w:val="20"/>
+      </w:rPr>
+    </w:lvl>
+  </w:abstractNum>
+  <w:abstractNum w:abstractNumId="1" w15:restartNumberingAfterBreak="0">
     <w:nsid w:val="22070E49"/>
     <w:multiLevelType w:val="multilevel"/>
     <w:tmpl w:val="6E2ABB56"/>
@@ -440,7 +1035,156 @@
       </w:rPr>
     </w:lvl>
   </w:abstractNum>
-  <w:abstractNum w:abstractNumId="1" w15:restartNumberingAfterBreak="0">
+  <w:abstractNum w:abstractNumId="2" w15:restartNumberingAfterBreak="0">
+    <w:nsid w:val="32FE6B36"/>
+    <w:multiLevelType w:val="multilevel"/>
+    <w:tmpl w:val="88A6EE2C"/>
+    <w:lvl w:ilvl="0">
+      <w:start w:val="1"/>
+      <w:numFmt w:val="bullet"/>
+      <w:lvlText w:val=""/>
+      <w:lvlJc w:val="left"/>
+      <w:pPr>
+        <w:tabs>
+          <w:tab w:val="num" w:pos="720"/>
+        </w:tabs>
+        <w:ind w:left="720" w:hanging="360"/>
+      </w:pPr>
+      <w:rPr>
+        <w:rFonts w:ascii="Symbol" w:hAnsi="Symbol" w:hint="default"/>
+        <w:sz w:val="20"/>
+      </w:rPr>
+    </w:lvl>
+    <w:lvl w:ilvl="1" w:tentative="1">
+      <w:start w:val="1"/>
+      <w:numFmt w:val="bullet"/>
+      <w:lvlText w:val="o"/>
+      <w:lvlJc w:val="left"/>
+      <w:pPr>
+        <w:tabs>
+          <w:tab w:val="num" w:pos="1440"/>
+        </w:tabs>
+        <w:ind w:left="1440" w:hanging="360"/>
+      </w:pPr>
+      <w:rPr>
+        <w:rFonts w:ascii="Courier New" w:hAnsi="Courier New" w:hint="default"/>
+        <w:sz w:val="20"/>
+      </w:rPr>
+    </w:lvl>
+    <w:lvl w:ilvl="2" w:tentative="1">
+      <w:start w:val="1"/>
+      <w:numFmt w:val="bullet"/>
+      <w:lvlText w:val=""/>
+      <w:lvlJc w:val="left"/>
+      <w:pPr>
+        <w:tabs>
+          <w:tab w:val="num" w:pos="2160"/>
+        </w:tabs>
+        <w:ind w:left="2160" w:hanging="360"/>
+      </w:pPr>
+      <w:rPr>
+        <w:rFonts w:ascii="Wingdings" w:hAnsi="Wingdings" w:hint="default"/>
+        <w:sz w:val="20"/>
+      </w:rPr>
+    </w:lvl>
+    <w:lvl w:ilvl="3" w:tentative="1">
+      <w:start w:val="1"/>
+      <w:numFmt w:val="bullet"/>
+      <w:lvlText w:val=""/>
+      <w:lvlJc w:val="left"/>
+      <w:pPr>
+        <w:tabs>
+          <w:tab w:val="num" w:pos="2880"/>
+        </w:tabs>
+        <w:ind w:left="2880" w:hanging="360"/>
+      </w:pPr>
+      <w:rPr>
+        <w:rFonts w:ascii="Wingdings" w:hAnsi="Wingdings" w:hint="default"/>
+        <w:sz w:val="20"/>
+      </w:rPr>
+    </w:lvl>
+    <w:lvl w:ilvl="4" w:tentative="1">
+      <w:start w:val="1"/>
+      <w:numFmt w:val="bullet"/>
+      <w:lvlText w:val=""/>
+      <w:lvlJc w:val="left"/>
+      <w:pPr>
+        <w:tabs>
+          <w:tab w:val="num" w:pos="3600"/>
+        </w:tabs>
+        <w:ind w:left="3600" w:hanging="360"/>
+      </w:pPr>
+      <w:rPr>
+        <w:rFonts w:ascii="Wingdings" w:hAnsi="Wingdings" w:hint="default"/>
+        <w:sz w:val="20"/>
+      </w:rPr>
+    </w:lvl>
+    <w:lvl w:ilvl="5" w:tentative="1">
+      <w:start w:val="1"/>
+      <w:numFmt w:val="bullet"/>
+      <w:lvlText w:val=""/>
+      <w:lvlJc w:val="left"/>
+      <w:pPr>
+        <w:tabs>
+          <w:tab w:val="num" w:pos="4320"/>
+        </w:tabs>
+        <w:ind w:left="4320" w:hanging="360"/>
+      </w:pPr>
+      <w:rPr>
+        <w:rFonts w:ascii="Wingdings" w:hAnsi="Wingdings" w:hint="default"/>
+        <w:sz w:val="20"/>
+      </w:rPr>
+    </w:lvl>
+    <w:lvl w:ilvl="6" w:tentative="1">
+      <w:start w:val="1"/>
+      <w:numFmt w:val="bullet"/>
+      <w:lvlText w:val=""/>
+      <w:lvlJc w:val="left"/>
+      <w:pPr>
+        <w:tabs>
+          <w:tab w:val="num" w:pos="5040"/>
+        </w:tabs>
+        <w:ind w:left="5040" w:hanging="360"/>
+      </w:pPr>
+      <w:rPr>
+        <w:rFonts w:ascii="Wingdings" w:hAnsi="Wingdings" w:hint="default"/>
+        <w:sz w:val="20"/>
+      </w:rPr>
+    </w:lvl>
+    <w:lvl w:ilvl="7" w:tentative="1">
+      <w:start w:val="1"/>
+      <w:numFmt w:val="bullet"/>
+      <w:lvlText w:val=""/>
+      <w:lvlJc w:val="left"/>
+      <w:pPr>
+        <w:tabs>
+          <w:tab w:val="num" w:pos="5760"/>
+        </w:tabs>
+        <w:ind w:left="5760" w:hanging="360"/>
+      </w:pPr>
+      <w:rPr>
+        <w:rFonts w:ascii="Wingdings" w:hAnsi="Wingdings" w:hint="default"/>
+        <w:sz w:val="20"/>
+      </w:rPr>
+    </w:lvl>
+    <w:lvl w:ilvl="8" w:tentative="1">
+      <w:start w:val="1"/>
+      <w:numFmt w:val="bullet"/>
+      <w:lvlText w:val=""/>
+      <w:lvlJc w:val="left"/>
+      <w:pPr>
+        <w:tabs>
+          <w:tab w:val="num" w:pos="6480"/>
+        </w:tabs>
+        <w:ind w:left="6480" w:hanging="360"/>
+      </w:pPr>
+      <w:rPr>
+        <w:rFonts w:ascii="Wingdings" w:hAnsi="Wingdings" w:hint="default"/>
+        <w:sz w:val="20"/>
+      </w:rPr>
+    </w:lvl>
+  </w:abstractNum>
+  <w:abstractNum w:abstractNumId="3" w15:restartNumberingAfterBreak="0">
     <w:nsid w:val="6A760C14"/>
     <w:multiLevelType w:val="multilevel"/>
     <w:tmpl w:val="19DC4C68"/>
@@ -590,9 +1334,15 @@
     </w:lvl>
   </w:abstractNum>
   <w:num w:numId="1" w16cid:durableId="1669286953">
+    <w:abstractNumId w:val="3"/>
+  </w:num>
+  <w:num w:numId="2" w16cid:durableId="1133400485">
     <w:abstractNumId w:val="1"/>
   </w:num>
-  <w:num w:numId="2" w16cid:durableId="1133400485">
+  <w:num w:numId="3" w16cid:durableId="1466662182">
+    <w:abstractNumId w:val="2"/>
+  </w:num>
+  <w:num w:numId="4" w16cid:durableId="1109471598">
     <w:abstractNumId w:val="0"/>
   </w:num>
 </w:numbering>

</xml_diff>

<commit_message>
Se agrega el caso de uso brindado en el problema
</commit_message>
<xml_diff>
--- a/Documentacion/analisis.docx
+++ b/Documentacion/analisis.docx
@@ -717,6 +717,367 @@
         </w:rPr>
         <w:t xml:space="preserve"> se encarga de la administración de los usuarios y de las opciones que requieren permisos especiales.</w:t>
       </w:r>
+    </w:p>
+    <w:p>
+      <w:pPr>
+        <w:spacing w:after="0"/>
+        <w:ind w:left="720"/>
+        <w:rPr>
+          <w:rFonts w:ascii="Arial" w:hAnsi="Arial" w:cs="Arial"/>
+        </w:rPr>
+      </w:pPr>
+    </w:p>
+    <w:p>
+      <w:pPr>
+        <w:spacing w:after="0"/>
+        <w:rPr>
+          <w:rFonts w:ascii="Arial" w:hAnsi="Arial" w:cs="Arial"/>
+          <w:b/>
+          <w:bCs/>
+        </w:rPr>
+      </w:pPr>
+      <w:r>
+        <w:rPr>
+          <w:rFonts w:ascii="Arial" w:hAnsi="Arial" w:cs="Arial"/>
+          <w:b/>
+          <w:bCs/>
+        </w:rPr>
+        <w:t>6. Interacción de los usuarios con el sistema</w:t>
+      </w:r>
+    </w:p>
+    <w:p>
+      <w:pPr>
+        <w:spacing w:after="0"/>
+        <w:rPr>
+          <w:rFonts w:ascii="Arial" w:hAnsi="Arial" w:cs="Arial"/>
+        </w:rPr>
+      </w:pPr>
+      <w:r>
+        <w:rPr>
+          <w:rFonts w:ascii="Arial" w:hAnsi="Arial" w:cs="Arial"/>
+        </w:rPr>
+        <w:t>Cada usuario tiene una forma diferente de utilizar el sistema de acuerdo con las funciones que necesita:</w:t>
+      </w:r>
+    </w:p>
+    <w:p>
+      <w:pPr>
+        <w:numPr>
+          <w:ilvl w:val="0"/>
+          <w:numId w:val="5"/>
+        </w:numPr>
+        <w:spacing w:after="0"/>
+        <w:rPr>
+          <w:rFonts w:ascii="Arial" w:hAnsi="Arial" w:cs="Arial"/>
+        </w:rPr>
+      </w:pPr>
+      <w:r>
+        <w:rPr>
+          <w:rFonts w:ascii="Arial" w:hAnsi="Arial" w:cs="Arial"/>
+          <w:b/>
+          <w:bCs/>
+        </w:rPr>
+        <w:t>Profesora:</w:t>
+      </w:r>
+      <w:r>
+        <w:rPr>
+          <w:rFonts w:ascii="Arial" w:hAnsi="Arial" w:cs="Arial"/>
+        </w:rPr>
+        <w:t xml:space="preserve"> administra las tareas y utiliza las opciones necesarias para organizar las actividades de los estudiantes.</w:t>
+      </w:r>
+    </w:p>
+    <w:p>
+      <w:pPr>
+        <w:numPr>
+          <w:ilvl w:val="0"/>
+          <w:numId w:val="5"/>
+        </w:numPr>
+        <w:spacing w:after="0"/>
+        <w:rPr>
+          <w:rFonts w:ascii="Arial" w:hAnsi="Arial" w:cs="Arial"/>
+        </w:rPr>
+      </w:pPr>
+      <w:r>
+        <w:rPr>
+          <w:rFonts w:ascii="Arial" w:hAnsi="Arial" w:cs="Arial"/>
+          <w:b/>
+          <w:bCs/>
+        </w:rPr>
+        <w:t>Estudiante:</w:t>
+      </w:r>
+      <w:r>
+        <w:rPr>
+          <w:rFonts w:ascii="Arial" w:hAnsi="Arial" w:cs="Arial"/>
+        </w:rPr>
+        <w:t xml:space="preserve"> consulta las tareas disponibles para conocer qué actividades debe realizar.</w:t>
+      </w:r>
+    </w:p>
+    <w:p>
+      <w:pPr>
+        <w:numPr>
+          <w:ilvl w:val="0"/>
+          <w:numId w:val="5"/>
+        </w:numPr>
+        <w:spacing w:after="0"/>
+        <w:rPr>
+          <w:rFonts w:ascii="Arial" w:hAnsi="Arial" w:cs="Arial"/>
+        </w:rPr>
+      </w:pPr>
+      <w:r>
+        <w:rPr>
+          <w:rFonts w:ascii="Arial" w:hAnsi="Arial" w:cs="Arial"/>
+          <w:b/>
+          <w:bCs/>
+        </w:rPr>
+        <w:t>Administrador:</w:t>
+      </w:r>
+      <w:r>
+        <w:rPr>
+          <w:rFonts w:ascii="Arial" w:hAnsi="Arial" w:cs="Arial"/>
+        </w:rPr>
+        <w:t xml:space="preserve"> controla la información de los usuarios y las opciones que requieren permisos administrativos.</w:t>
+      </w:r>
+    </w:p>
+    <w:p>
+      <w:pPr>
+        <w:spacing w:after="0"/>
+        <w:rPr>
+          <w:rFonts w:ascii="Arial" w:hAnsi="Arial" w:cs="Arial"/>
+        </w:rPr>
+      </w:pPr>
+      <w:r>
+        <w:rPr>
+          <w:rFonts w:ascii="Arial" w:hAnsi="Arial" w:cs="Arial"/>
+        </w:rPr>
+        <w:t>Estas interacciones permiten establecer qué funciones estarán disponibles para cada tipo de usuario y ayudan a mantener un control adecuado de los permisos dentro del sistema.</w:t>
+      </w:r>
+    </w:p>
+    <w:p>
+      <w:pPr>
+        <w:spacing w:after="0"/>
+        <w:rPr>
+          <w:rFonts w:ascii="Arial" w:hAnsi="Arial" w:cs="Arial"/>
+        </w:rPr>
+      </w:pPr>
+    </w:p>
+    <w:p>
+      <w:pPr>
+        <w:spacing w:after="0"/>
+        <w:rPr>
+          <w:rFonts w:ascii="Arial" w:hAnsi="Arial" w:cs="Arial"/>
+          <w:b/>
+          <w:bCs/>
+        </w:rPr>
+      </w:pPr>
+    </w:p>
+    <w:p>
+      <w:pPr>
+        <w:spacing w:after="0"/>
+        <w:rPr>
+          <w:rFonts w:ascii="Arial" w:hAnsi="Arial" w:cs="Arial"/>
+          <w:b/>
+          <w:bCs/>
+        </w:rPr>
+      </w:pPr>
+    </w:p>
+    <w:p>
+      <w:pPr>
+        <w:spacing w:after="0"/>
+        <w:rPr>
+          <w:rFonts w:ascii="Arial" w:hAnsi="Arial" w:cs="Arial"/>
+          <w:b/>
+          <w:bCs/>
+        </w:rPr>
+      </w:pPr>
+    </w:p>
+    <w:p>
+      <w:pPr>
+        <w:spacing w:after="0"/>
+        <w:rPr>
+          <w:rFonts w:ascii="Arial" w:hAnsi="Arial" w:cs="Arial"/>
+          <w:b/>
+          <w:bCs/>
+        </w:rPr>
+      </w:pPr>
+    </w:p>
+    <w:p>
+      <w:pPr>
+        <w:spacing w:after="0"/>
+        <w:rPr>
+          <w:rFonts w:ascii="Arial" w:hAnsi="Arial" w:cs="Arial"/>
+          <w:b/>
+          <w:bCs/>
+        </w:rPr>
+      </w:pPr>
+    </w:p>
+    <w:p>
+      <w:pPr>
+        <w:spacing w:after="0"/>
+        <w:rPr>
+          <w:rFonts w:ascii="Arial" w:hAnsi="Arial" w:cs="Arial"/>
+          <w:b/>
+          <w:bCs/>
+        </w:rPr>
+      </w:pPr>
+    </w:p>
+    <w:p>
+      <w:pPr>
+        <w:spacing w:after="0"/>
+        <w:rPr>
+          <w:rFonts w:ascii="Arial" w:hAnsi="Arial" w:cs="Arial"/>
+          <w:b/>
+          <w:bCs/>
+        </w:rPr>
+      </w:pPr>
+    </w:p>
+    <w:p>
+      <w:pPr>
+        <w:spacing w:after="0"/>
+        <w:rPr>
+          <w:rFonts w:ascii="Arial" w:hAnsi="Arial" w:cs="Arial"/>
+          <w:b/>
+          <w:bCs/>
+        </w:rPr>
+      </w:pPr>
+    </w:p>
+    <w:p>
+      <w:pPr>
+        <w:spacing w:after="0"/>
+        <w:rPr>
+          <w:rFonts w:ascii="Arial" w:hAnsi="Arial" w:cs="Arial"/>
+          <w:b/>
+          <w:bCs/>
+        </w:rPr>
+      </w:pPr>
+    </w:p>
+    <w:p>
+      <w:pPr>
+        <w:spacing w:after="0"/>
+        <w:rPr>
+          <w:rFonts w:ascii="Arial" w:hAnsi="Arial" w:cs="Arial"/>
+          <w:b/>
+          <w:bCs/>
+        </w:rPr>
+      </w:pPr>
+    </w:p>
+    <w:p>
+      <w:pPr>
+        <w:spacing w:after="0"/>
+        <w:rPr>
+          <w:rFonts w:ascii="Arial" w:hAnsi="Arial" w:cs="Arial"/>
+          <w:b/>
+          <w:bCs/>
+        </w:rPr>
+      </w:pPr>
+    </w:p>
+    <w:p>
+      <w:pPr>
+        <w:spacing w:after="0"/>
+        <w:rPr>
+          <w:rFonts w:ascii="Arial" w:hAnsi="Arial" w:cs="Arial"/>
+          <w:b/>
+          <w:bCs/>
+        </w:rPr>
+      </w:pPr>
+    </w:p>
+    <w:p>
+      <w:pPr>
+        <w:spacing w:after="0"/>
+        <w:rPr>
+          <w:rFonts w:ascii="Arial" w:hAnsi="Arial" w:cs="Arial"/>
+          <w:b/>
+          <w:bCs/>
+        </w:rPr>
+      </w:pPr>
+    </w:p>
+    <w:p>
+      <w:pPr>
+        <w:spacing w:after="0"/>
+        <w:rPr>
+          <w:rFonts w:ascii="Arial" w:hAnsi="Arial" w:cs="Arial"/>
+          <w:b/>
+          <w:bCs/>
+        </w:rPr>
+      </w:pPr>
+      <w:r>
+        <w:rPr>
+          <w:rFonts w:ascii="Arial" w:hAnsi="Arial" w:cs="Arial"/>
+          <w:b/>
+          <w:bCs/>
+        </w:rPr>
+        <w:lastRenderedPageBreak/>
+        <w:t>7. Caso de Uso</w:t>
+      </w:r>
+    </w:p>
+    <w:p>
+      <w:pPr>
+        <w:spacing w:after="0"/>
+        <w:rPr>
+          <w:rFonts w:ascii="Arial" w:hAnsi="Arial" w:cs="Arial"/>
+        </w:rPr>
+      </w:pPr>
+      <w:r>
+        <w:rPr>
+          <w:rFonts w:ascii="Arial" w:eastAsia="Arial" w:hAnsi="Arial" w:cs="Arial"/>
+          <w:noProof/>
+        </w:rPr>
+        <w:drawing>
+          <wp:anchor distT="0" distB="0" distL="114300" distR="114300" simplePos="0" relativeHeight="251658240" behindDoc="0" locked="0" layoutInCell="1" allowOverlap="1" wp14:anchorId="07C791E6" wp14:editId="65D5473C">
+            <wp:simplePos x="0" y="0"/>
+            <wp:positionH relativeFrom="column">
+              <wp:posOffset>0</wp:posOffset>
+            </wp:positionH>
+            <wp:positionV relativeFrom="paragraph">
+              <wp:posOffset>259796</wp:posOffset>
+            </wp:positionV>
+            <wp:extent cx="5612130" cy="4965065"/>
+            <wp:effectExtent l="0" t="0" r="7620" b="6985"/>
+            <wp:wrapTopAndBottom/>
+            <wp:docPr id="2059095509" name="image14.png" descr="A diagram of a company&#10;&#10;AI-generated content may be incorrect."/>
+            <wp:cNvGraphicFramePr/>
+            <a:graphic xmlns:a="http://schemas.openxmlformats.org/drawingml/2006/main">
+              <a:graphicData uri="http://schemas.openxmlformats.org/drawingml/2006/picture">
+                <pic:pic xmlns:pic="http://schemas.openxmlformats.org/drawingml/2006/picture">
+                  <pic:nvPicPr>
+                    <pic:cNvPr id="0" name="image14.png" descr="A diagram of a company&#10;&#10;AI-generated content may be incorrect."/>
+                    <pic:cNvPicPr preferRelativeResize="0"/>
+                  </pic:nvPicPr>
+                  <pic:blipFill>
+                    <a:blip r:embed="rId5">
+                      <a:extLst>
+                        <a:ext uri="{28A0092B-C50C-407E-A947-70E740481C1C}">
+                          <a14:useLocalDpi xmlns:a14="http://schemas.microsoft.com/office/drawing/2010/main" val="0"/>
+                        </a:ext>
+                      </a:extLst>
+                    </a:blip>
+                    <a:srcRect/>
+                    <a:stretch>
+                      <a:fillRect/>
+                    </a:stretch>
+                  </pic:blipFill>
+                  <pic:spPr>
+                    <a:xfrm>
+                      <a:off x="0" y="0"/>
+                      <a:ext cx="5612130" cy="4965065"/>
+                    </a:xfrm>
+                    <a:prstGeom prst="rect">
+                      <a:avLst/>
+                    </a:prstGeom>
+                    <a:ln/>
+                  </pic:spPr>
+                </pic:pic>
+              </a:graphicData>
+            </a:graphic>
+          </wp:anchor>
+        </w:drawing>
+      </w:r>
+    </w:p>
+    <w:p>
+      <w:pPr>
+        <w:spacing w:after="0"/>
+        <w:rPr>
+          <w:rFonts w:ascii="Arial" w:hAnsi="Arial" w:cs="Arial"/>
+        </w:rPr>
+      </w:pPr>
     </w:p>
     <w:p>
       <w:pPr>
@@ -887,6 +1248,155 @@
     </w:lvl>
   </w:abstractNum>
   <w:abstractNum w:abstractNumId="1" w15:restartNumberingAfterBreak="0">
+    <w:nsid w:val="11DA0580"/>
+    <w:multiLevelType w:val="multilevel"/>
+    <w:tmpl w:val="7F2ADD8E"/>
+    <w:lvl w:ilvl="0">
+      <w:start w:val="1"/>
+      <w:numFmt w:val="bullet"/>
+      <w:lvlText w:val=""/>
+      <w:lvlJc w:val="left"/>
+      <w:pPr>
+        <w:tabs>
+          <w:tab w:val="num" w:pos="720"/>
+        </w:tabs>
+        <w:ind w:left="720" w:hanging="360"/>
+      </w:pPr>
+      <w:rPr>
+        <w:rFonts w:ascii="Symbol" w:hAnsi="Symbol" w:hint="default"/>
+        <w:sz w:val="20"/>
+      </w:rPr>
+    </w:lvl>
+    <w:lvl w:ilvl="1" w:tentative="1">
+      <w:start w:val="1"/>
+      <w:numFmt w:val="bullet"/>
+      <w:lvlText w:val="o"/>
+      <w:lvlJc w:val="left"/>
+      <w:pPr>
+        <w:tabs>
+          <w:tab w:val="num" w:pos="1440"/>
+        </w:tabs>
+        <w:ind w:left="1440" w:hanging="360"/>
+      </w:pPr>
+      <w:rPr>
+        <w:rFonts w:ascii="Courier New" w:hAnsi="Courier New" w:hint="default"/>
+        <w:sz w:val="20"/>
+      </w:rPr>
+    </w:lvl>
+    <w:lvl w:ilvl="2" w:tentative="1">
+      <w:start w:val="1"/>
+      <w:numFmt w:val="bullet"/>
+      <w:lvlText w:val=""/>
+      <w:lvlJc w:val="left"/>
+      <w:pPr>
+        <w:tabs>
+          <w:tab w:val="num" w:pos="2160"/>
+        </w:tabs>
+        <w:ind w:left="2160" w:hanging="360"/>
+      </w:pPr>
+      <w:rPr>
+        <w:rFonts w:ascii="Wingdings" w:hAnsi="Wingdings" w:hint="default"/>
+        <w:sz w:val="20"/>
+      </w:rPr>
+    </w:lvl>
+    <w:lvl w:ilvl="3" w:tentative="1">
+      <w:start w:val="1"/>
+      <w:numFmt w:val="bullet"/>
+      <w:lvlText w:val=""/>
+      <w:lvlJc w:val="left"/>
+      <w:pPr>
+        <w:tabs>
+          <w:tab w:val="num" w:pos="2880"/>
+        </w:tabs>
+        <w:ind w:left="2880" w:hanging="360"/>
+      </w:pPr>
+      <w:rPr>
+        <w:rFonts w:ascii="Wingdings" w:hAnsi="Wingdings" w:hint="default"/>
+        <w:sz w:val="20"/>
+      </w:rPr>
+    </w:lvl>
+    <w:lvl w:ilvl="4" w:tentative="1">
+      <w:start w:val="1"/>
+      <w:numFmt w:val="bullet"/>
+      <w:lvlText w:val=""/>
+      <w:lvlJc w:val="left"/>
+      <w:pPr>
+        <w:tabs>
+          <w:tab w:val="num" w:pos="3600"/>
+        </w:tabs>
+        <w:ind w:left="3600" w:hanging="360"/>
+      </w:pPr>
+      <w:rPr>
+        <w:rFonts w:ascii="Wingdings" w:hAnsi="Wingdings" w:hint="default"/>
+        <w:sz w:val="20"/>
+      </w:rPr>
+    </w:lvl>
+    <w:lvl w:ilvl="5" w:tentative="1">
+      <w:start w:val="1"/>
+      <w:numFmt w:val="bullet"/>
+      <w:lvlText w:val=""/>
+      <w:lvlJc w:val="left"/>
+      <w:pPr>
+        <w:tabs>
+          <w:tab w:val="num" w:pos="4320"/>
+        </w:tabs>
+        <w:ind w:left="4320" w:hanging="360"/>
+      </w:pPr>
+      <w:rPr>
+        <w:rFonts w:ascii="Wingdings" w:hAnsi="Wingdings" w:hint="default"/>
+        <w:sz w:val="20"/>
+      </w:rPr>
+    </w:lvl>
+    <w:lvl w:ilvl="6" w:tentative="1">
+      <w:start w:val="1"/>
+      <w:numFmt w:val="bullet"/>
+      <w:lvlText w:val=""/>
+      <w:lvlJc w:val="left"/>
+      <w:pPr>
+        <w:tabs>
+          <w:tab w:val="num" w:pos="5040"/>
+        </w:tabs>
+        <w:ind w:left="5040" w:hanging="360"/>
+      </w:pPr>
+      <w:rPr>
+        <w:rFonts w:ascii="Wingdings" w:hAnsi="Wingdings" w:hint="default"/>
+        <w:sz w:val="20"/>
+      </w:rPr>
+    </w:lvl>
+    <w:lvl w:ilvl="7" w:tentative="1">
+      <w:start w:val="1"/>
+      <w:numFmt w:val="bullet"/>
+      <w:lvlText w:val=""/>
+      <w:lvlJc w:val="left"/>
+      <w:pPr>
+        <w:tabs>
+          <w:tab w:val="num" w:pos="5760"/>
+        </w:tabs>
+        <w:ind w:left="5760" w:hanging="360"/>
+      </w:pPr>
+      <w:rPr>
+        <w:rFonts w:ascii="Wingdings" w:hAnsi="Wingdings" w:hint="default"/>
+        <w:sz w:val="20"/>
+      </w:rPr>
+    </w:lvl>
+    <w:lvl w:ilvl="8" w:tentative="1">
+      <w:start w:val="1"/>
+      <w:numFmt w:val="bullet"/>
+      <w:lvlText w:val=""/>
+      <w:lvlJc w:val="left"/>
+      <w:pPr>
+        <w:tabs>
+          <w:tab w:val="num" w:pos="6480"/>
+        </w:tabs>
+        <w:ind w:left="6480" w:hanging="360"/>
+      </w:pPr>
+      <w:rPr>
+        <w:rFonts w:ascii="Wingdings" w:hAnsi="Wingdings" w:hint="default"/>
+        <w:sz w:val="20"/>
+      </w:rPr>
+    </w:lvl>
+  </w:abstractNum>
+  <w:abstractNum w:abstractNumId="2" w15:restartNumberingAfterBreak="0">
     <w:nsid w:val="22070E49"/>
     <w:multiLevelType w:val="multilevel"/>
     <w:tmpl w:val="6E2ABB56"/>
@@ -1035,7 +1545,7 @@
       </w:rPr>
     </w:lvl>
   </w:abstractNum>
-  <w:abstractNum w:abstractNumId="2" w15:restartNumberingAfterBreak="0">
+  <w:abstractNum w:abstractNumId="3" w15:restartNumberingAfterBreak="0">
     <w:nsid w:val="32FE6B36"/>
     <w:multiLevelType w:val="multilevel"/>
     <w:tmpl w:val="88A6EE2C"/>
@@ -1184,7 +1694,7 @@
       </w:rPr>
     </w:lvl>
   </w:abstractNum>
-  <w:abstractNum w:abstractNumId="3" w15:restartNumberingAfterBreak="0">
+  <w:abstractNum w:abstractNumId="4" w15:restartNumberingAfterBreak="0">
     <w:nsid w:val="6A760C14"/>
     <w:multiLevelType w:val="multilevel"/>
     <w:tmpl w:val="19DC4C68"/>
@@ -1334,16 +1844,19 @@
     </w:lvl>
   </w:abstractNum>
   <w:num w:numId="1" w16cid:durableId="1669286953">
-    <w:abstractNumId w:val="3"/>
+    <w:abstractNumId w:val="4"/>
   </w:num>
   <w:num w:numId="2" w16cid:durableId="1133400485">
-    <w:abstractNumId w:val="1"/>
+    <w:abstractNumId w:val="2"/>
   </w:num>
   <w:num w:numId="3" w16cid:durableId="1466662182">
-    <w:abstractNumId w:val="2"/>
+    <w:abstractNumId w:val="3"/>
   </w:num>
   <w:num w:numId="4" w16cid:durableId="1109471598">
     <w:abstractNumId w:val="0"/>
+  </w:num>
+  <w:num w:numId="5" w16cid:durableId="414128420">
+    <w:abstractNumId w:val="1"/>
   </w:num>
 </w:numbering>
 </file>
@@ -1951,6 +2464,7 @@
   <w:style w:type="character" w:default="1" w:styleId="Fuentedeprrafopredeter">
     <w:name w:val="Default Paragraph Font"/>
     <w:uiPriority w:val="1"/>
+    <w:semiHidden/>
     <w:unhideWhenUsed/>
   </w:style>
   <w:style w:type="table" w:default="1" w:styleId="Tablanormal">

</xml_diff>

<commit_message>
se agrega cambiar contrasenya
</commit_message>
<xml_diff>
--- a/Documentacion/analisis.docx
+++ b/Documentacion/analisis.docx
@@ -637,7 +637,19 @@
         <w:rPr>
           <w:rFonts w:ascii="Arial" w:hAnsi="Arial" w:cs="Arial"/>
         </w:rPr>
-        <w:t>Para el funcionamiento del sistema se identifican tres tipos de usuarios, cada uno con diferentes responsabilidades:</w:t>
+        <w:t xml:space="preserve">Para el funcionamiento del sistema se identifican </w:t>
+      </w:r>
+      <w:r>
+        <w:rPr>
+          <w:rFonts w:ascii="Arial" w:hAnsi="Arial" w:cs="Arial"/>
+        </w:rPr>
+        <w:t>dos</w:t>
+      </w:r>
+      <w:r>
+        <w:rPr>
+          <w:rFonts w:ascii="Arial" w:hAnsi="Arial" w:cs="Arial"/>
+        </w:rPr>
+        <w:t xml:space="preserve"> tipos de usuarios, cada uno con diferentes responsabilidades:</w:t>
       </w:r>
     </w:p>
     <w:p>
@@ -694,41 +706,6 @@
     </w:p>
     <w:p>
       <w:pPr>
-        <w:numPr>
-          <w:ilvl w:val="0"/>
-          <w:numId w:val="4"/>
-        </w:numPr>
-        <w:spacing w:after="0"/>
-        <w:rPr>
-          <w:rFonts w:ascii="Arial" w:hAnsi="Arial" w:cs="Arial"/>
-        </w:rPr>
-      </w:pPr>
-      <w:r>
-        <w:rPr>
-          <w:rFonts w:ascii="Arial" w:hAnsi="Arial" w:cs="Arial"/>
-          <w:b/>
-          <w:bCs/>
-        </w:rPr>
-        <w:t>Administrador:</w:t>
-      </w:r>
-      <w:r>
-        <w:rPr>
-          <w:rFonts w:ascii="Arial" w:hAnsi="Arial" w:cs="Arial"/>
-        </w:rPr>
-        <w:t xml:space="preserve"> se encarga de la administración de los usuarios y de las opciones que requieren permisos especiales.</w:t>
-      </w:r>
-    </w:p>
-    <w:p>
-      <w:pPr>
-        <w:spacing w:after="0"/>
-        <w:ind w:left="720"/>
-        <w:rPr>
-          <w:rFonts w:ascii="Arial" w:hAnsi="Arial" w:cs="Arial"/>
-        </w:rPr>
-      </w:pPr>
-    </w:p>
-    <w:p>
-      <w:pPr>
         <w:spacing w:after="0"/>
         <w:rPr>
           <w:rFonts w:ascii="Arial" w:hAnsi="Arial" w:cs="Arial"/>
@@ -813,32 +790,6 @@
     </w:p>
     <w:p>
       <w:pPr>
-        <w:numPr>
-          <w:ilvl w:val="0"/>
-          <w:numId w:val="5"/>
-        </w:numPr>
-        <w:spacing w:after="0"/>
-        <w:rPr>
-          <w:rFonts w:ascii="Arial" w:hAnsi="Arial" w:cs="Arial"/>
-        </w:rPr>
-      </w:pPr>
-      <w:r>
-        <w:rPr>
-          <w:rFonts w:ascii="Arial" w:hAnsi="Arial" w:cs="Arial"/>
-          <w:b/>
-          <w:bCs/>
-        </w:rPr>
-        <w:t>Administrador:</w:t>
-      </w:r>
-      <w:r>
-        <w:rPr>
-          <w:rFonts w:ascii="Arial" w:hAnsi="Arial" w:cs="Arial"/>
-        </w:rPr>
-        <w:t xml:space="preserve"> controla la información de los usuarios y las opciones que requieren permisos administrativos.</w:t>
-      </w:r>
-    </w:p>
-    <w:p>
-      <w:pPr>
         <w:spacing w:after="0"/>
         <w:rPr>
           <w:rFonts w:ascii="Arial" w:hAnsi="Arial" w:cs="Arial"/>
@@ -864,147 +815,200 @@
         <w:spacing w:after="0"/>
         <w:rPr>
           <w:rFonts w:ascii="Arial" w:hAnsi="Arial" w:cs="Arial"/>
-          <w:b/>
-          <w:bCs/>
-        </w:rPr>
-      </w:pPr>
-    </w:p>
-    <w:p>
-      <w:pPr>
-        <w:spacing w:after="0"/>
-        <w:rPr>
-          <w:rFonts w:ascii="Arial" w:hAnsi="Arial" w:cs="Arial"/>
-          <w:b/>
-          <w:bCs/>
-        </w:rPr>
-      </w:pPr>
-    </w:p>
-    <w:p>
-      <w:pPr>
-        <w:spacing w:after="0"/>
-        <w:rPr>
-          <w:rFonts w:ascii="Arial" w:hAnsi="Arial" w:cs="Arial"/>
-          <w:b/>
-          <w:bCs/>
-        </w:rPr>
-      </w:pPr>
-    </w:p>
-    <w:p>
-      <w:pPr>
-        <w:spacing w:after="0"/>
-        <w:rPr>
-          <w:rFonts w:ascii="Arial" w:hAnsi="Arial" w:cs="Arial"/>
-          <w:b/>
-          <w:bCs/>
-        </w:rPr>
-      </w:pPr>
-    </w:p>
-    <w:p>
-      <w:pPr>
-        <w:spacing w:after="0"/>
-        <w:rPr>
-          <w:rFonts w:ascii="Arial" w:hAnsi="Arial" w:cs="Arial"/>
-          <w:b/>
-          <w:bCs/>
-        </w:rPr>
-      </w:pPr>
-    </w:p>
-    <w:p>
-      <w:pPr>
-        <w:spacing w:after="0"/>
-        <w:rPr>
-          <w:rFonts w:ascii="Arial" w:hAnsi="Arial" w:cs="Arial"/>
-          <w:b/>
-          <w:bCs/>
-        </w:rPr>
-      </w:pPr>
-    </w:p>
-    <w:p>
-      <w:pPr>
-        <w:spacing w:after="0"/>
-        <w:rPr>
-          <w:rFonts w:ascii="Arial" w:hAnsi="Arial" w:cs="Arial"/>
-          <w:b/>
-          <w:bCs/>
-        </w:rPr>
-      </w:pPr>
-    </w:p>
-    <w:p>
-      <w:pPr>
-        <w:spacing w:after="0"/>
-        <w:rPr>
-          <w:rFonts w:ascii="Arial" w:hAnsi="Arial" w:cs="Arial"/>
-          <w:b/>
-          <w:bCs/>
-        </w:rPr>
-      </w:pPr>
-    </w:p>
-    <w:p>
-      <w:pPr>
-        <w:spacing w:after="0"/>
-        <w:rPr>
-          <w:rFonts w:ascii="Arial" w:hAnsi="Arial" w:cs="Arial"/>
-          <w:b/>
-          <w:bCs/>
-        </w:rPr>
-      </w:pPr>
-    </w:p>
-    <w:p>
-      <w:pPr>
-        <w:spacing w:after="0"/>
-        <w:rPr>
-          <w:rFonts w:ascii="Arial" w:hAnsi="Arial" w:cs="Arial"/>
-          <w:b/>
-          <w:bCs/>
-        </w:rPr>
-      </w:pPr>
-    </w:p>
-    <w:p>
-      <w:pPr>
-        <w:spacing w:after="0"/>
-        <w:rPr>
-          <w:rFonts w:ascii="Arial" w:hAnsi="Arial" w:cs="Arial"/>
-          <w:b/>
-          <w:bCs/>
-        </w:rPr>
-      </w:pPr>
-    </w:p>
-    <w:p>
-      <w:pPr>
-        <w:spacing w:after="0"/>
-        <w:rPr>
-          <w:rFonts w:ascii="Arial" w:hAnsi="Arial" w:cs="Arial"/>
-          <w:b/>
-          <w:bCs/>
-        </w:rPr>
-      </w:pPr>
-    </w:p>
-    <w:p>
-      <w:pPr>
-        <w:spacing w:after="0"/>
-        <w:rPr>
-          <w:rFonts w:ascii="Arial" w:hAnsi="Arial" w:cs="Arial"/>
-          <w:b/>
-          <w:bCs/>
-        </w:rPr>
-      </w:pPr>
-    </w:p>
-    <w:p>
-      <w:pPr>
-        <w:spacing w:after="0"/>
-        <w:rPr>
-          <w:rFonts w:ascii="Arial" w:hAnsi="Arial" w:cs="Arial"/>
-          <w:b/>
-          <w:bCs/>
-        </w:rPr>
-      </w:pPr>
-      <w:r>
-        <w:rPr>
-          <w:rFonts w:ascii="Arial" w:hAnsi="Arial" w:cs="Arial"/>
-          <w:b/>
-          <w:bCs/>
-        </w:rPr>
-        <w:lastRenderedPageBreak/>
+        </w:rPr>
+      </w:pPr>
+    </w:p>
+    <w:p>
+      <w:pPr>
+        <w:spacing w:after="0"/>
+        <w:rPr>
+          <w:rFonts w:ascii="Arial" w:hAnsi="Arial" w:cs="Arial"/>
+        </w:rPr>
+      </w:pPr>
+    </w:p>
+    <w:p>
+      <w:pPr>
+        <w:spacing w:after="0"/>
+        <w:rPr>
+          <w:rFonts w:ascii="Arial" w:hAnsi="Arial" w:cs="Arial"/>
+        </w:rPr>
+      </w:pPr>
+    </w:p>
+    <w:p>
+      <w:pPr>
+        <w:spacing w:after="0"/>
+        <w:rPr>
+          <w:rFonts w:ascii="Arial" w:hAnsi="Arial" w:cs="Arial"/>
+          <w:b/>
+          <w:bCs/>
+        </w:rPr>
+      </w:pPr>
+    </w:p>
+    <w:p>
+      <w:pPr>
+        <w:spacing w:after="0"/>
+        <w:rPr>
+          <w:rFonts w:ascii="Arial" w:hAnsi="Arial" w:cs="Arial"/>
+          <w:b/>
+          <w:bCs/>
+        </w:rPr>
+      </w:pPr>
+    </w:p>
+    <w:p>
+      <w:pPr>
+        <w:spacing w:after="0"/>
+        <w:rPr>
+          <w:rFonts w:ascii="Arial" w:hAnsi="Arial" w:cs="Arial"/>
+          <w:b/>
+          <w:bCs/>
+        </w:rPr>
+      </w:pPr>
+    </w:p>
+    <w:p>
+      <w:pPr>
+        <w:spacing w:after="0"/>
+        <w:rPr>
+          <w:rFonts w:ascii="Arial" w:hAnsi="Arial" w:cs="Arial"/>
+          <w:b/>
+          <w:bCs/>
+        </w:rPr>
+      </w:pPr>
+    </w:p>
+    <w:p>
+      <w:pPr>
+        <w:spacing w:after="0"/>
+        <w:rPr>
+          <w:rFonts w:ascii="Arial" w:hAnsi="Arial" w:cs="Arial"/>
+          <w:b/>
+          <w:bCs/>
+        </w:rPr>
+      </w:pPr>
+    </w:p>
+    <w:p>
+      <w:pPr>
+        <w:spacing w:after="0"/>
+        <w:rPr>
+          <w:rFonts w:ascii="Arial" w:hAnsi="Arial" w:cs="Arial"/>
+          <w:b/>
+          <w:bCs/>
+        </w:rPr>
+      </w:pPr>
+    </w:p>
+    <w:p>
+      <w:pPr>
+        <w:spacing w:after="0"/>
+        <w:rPr>
+          <w:rFonts w:ascii="Arial" w:hAnsi="Arial" w:cs="Arial"/>
+          <w:b/>
+          <w:bCs/>
+        </w:rPr>
+      </w:pPr>
+    </w:p>
+    <w:p>
+      <w:pPr>
+        <w:spacing w:after="0"/>
+        <w:rPr>
+          <w:rFonts w:ascii="Arial" w:hAnsi="Arial" w:cs="Arial"/>
+          <w:b/>
+          <w:bCs/>
+        </w:rPr>
+      </w:pPr>
+    </w:p>
+    <w:p>
+      <w:pPr>
+        <w:spacing w:after="0"/>
+        <w:rPr>
+          <w:rFonts w:ascii="Arial" w:hAnsi="Arial" w:cs="Arial"/>
+          <w:b/>
+          <w:bCs/>
+        </w:rPr>
+      </w:pPr>
+    </w:p>
+    <w:p>
+      <w:pPr>
+        <w:spacing w:after="0"/>
+        <w:rPr>
+          <w:rFonts w:ascii="Arial" w:hAnsi="Arial" w:cs="Arial"/>
+          <w:b/>
+          <w:bCs/>
+        </w:rPr>
+      </w:pPr>
+    </w:p>
+    <w:p>
+      <w:pPr>
+        <w:spacing w:after="0"/>
+        <w:rPr>
+          <w:rFonts w:ascii="Arial" w:hAnsi="Arial" w:cs="Arial"/>
+          <w:b/>
+          <w:bCs/>
+        </w:rPr>
+      </w:pPr>
+    </w:p>
+    <w:p>
+      <w:pPr>
+        <w:spacing w:after="0"/>
+        <w:rPr>
+          <w:rFonts w:ascii="Arial" w:hAnsi="Arial" w:cs="Arial"/>
+          <w:b/>
+          <w:bCs/>
+        </w:rPr>
+      </w:pPr>
+    </w:p>
+    <w:p>
+      <w:pPr>
+        <w:spacing w:after="0"/>
+        <w:rPr>
+          <w:rFonts w:ascii="Arial" w:hAnsi="Arial" w:cs="Arial"/>
+          <w:b/>
+          <w:bCs/>
+        </w:rPr>
+      </w:pPr>
+    </w:p>
+    <w:p>
+      <w:pPr>
+        <w:spacing w:after="0"/>
+        <w:rPr>
+          <w:rFonts w:ascii="Arial" w:hAnsi="Arial" w:cs="Arial"/>
+          <w:b/>
+          <w:bCs/>
+        </w:rPr>
+      </w:pPr>
+    </w:p>
+    <w:p>
+      <w:pPr>
+        <w:spacing w:after="0"/>
+        <w:rPr>
+          <w:rFonts w:ascii="Arial" w:hAnsi="Arial" w:cs="Arial"/>
+          <w:b/>
+          <w:bCs/>
+        </w:rPr>
+      </w:pPr>
+    </w:p>
+    <w:p>
+      <w:pPr>
+        <w:spacing w:after="0"/>
+        <w:rPr>
+          <w:rFonts w:ascii="Arial" w:hAnsi="Arial" w:cs="Arial"/>
+          <w:b/>
+          <w:bCs/>
+        </w:rPr>
+      </w:pPr>
+    </w:p>
+    <w:p>
+      <w:pPr>
+        <w:spacing w:after="0"/>
+        <w:rPr>
+          <w:rFonts w:ascii="Arial" w:hAnsi="Arial" w:cs="Arial"/>
+          <w:b/>
+          <w:bCs/>
+        </w:rPr>
+      </w:pPr>
+      <w:r>
+        <w:rPr>
+          <w:rFonts w:ascii="Arial" w:hAnsi="Arial" w:cs="Arial"/>
+          <w:b/>
+          <w:bCs/>
+        </w:rPr>
         <w:t>7. Caso de Uso</w:t>
       </w:r>
     </w:p>

</xml_diff>

<commit_message>
Documenta estructura inicial del proyecto
</commit_message>
<xml_diff>
--- a/Documentacion/analisis.docx
+++ b/Documentacion/analisis.docx
@@ -1276,13 +1276,13 @@
           <w:noProof/>
         </w:rPr>
         <w:drawing>
-          <wp:anchor distT="0" distB="0" distL="114300" distR="114300" simplePos="0" relativeHeight="251658240" behindDoc="0" locked="0" layoutInCell="1" allowOverlap="1" wp14:anchorId="07C791E6" wp14:editId="46A98784">
+          <wp:anchor distT="0" distB="0" distL="114300" distR="114300" simplePos="0" relativeHeight="251658240" behindDoc="0" locked="0" layoutInCell="1" allowOverlap="1" wp14:anchorId="07C791E6" wp14:editId="54E7C287">
             <wp:simplePos x="0" y="0"/>
             <wp:positionH relativeFrom="column">
               <wp:posOffset>472966</wp:posOffset>
             </wp:positionH>
             <wp:positionV relativeFrom="paragraph">
-              <wp:posOffset>224045</wp:posOffset>
+              <wp:posOffset>217849</wp:posOffset>
             </wp:positionV>
             <wp:extent cx="5612130" cy="4965065"/>
             <wp:effectExtent l="0" t="0" r="7620" b="6985"/>
@@ -1325,6 +1325,551 @@
           </wp:anchor>
         </w:drawing>
       </w:r>
+    </w:p>
+    <w:p>
+      <w:pPr>
+        <w:rPr>
+          <w:rFonts w:ascii="Arial" w:hAnsi="Arial" w:cs="Arial"/>
+        </w:rPr>
+      </w:pPr>
+    </w:p>
+    <w:p>
+      <w:pPr>
+        <w:tabs>
+          <w:tab w:val="left" w:pos="9559"/>
+        </w:tabs>
+        <w:rPr>
+          <w:rFonts w:ascii="Arial" w:hAnsi="Arial" w:cs="Arial"/>
+        </w:rPr>
+      </w:pPr>
+      <w:r>
+        <w:rPr>
+          <w:rFonts w:ascii="Arial" w:hAnsi="Arial" w:cs="Arial"/>
+        </w:rPr>
+        <w:tab/>
+      </w:r>
+    </w:p>
+    <w:p>
+      <w:pPr>
+        <w:tabs>
+          <w:tab w:val="left" w:pos="9559"/>
+        </w:tabs>
+        <w:rPr>
+          <w:rFonts w:ascii="Arial" w:hAnsi="Arial" w:cs="Arial"/>
+          <w:b/>
+          <w:bCs/>
+        </w:rPr>
+      </w:pPr>
+      <w:r>
+        <w:rPr>
+          <w:rFonts w:ascii="Arial" w:hAnsi="Arial" w:cs="Arial"/>
+          <w:b/>
+          <w:bCs/>
+        </w:rPr>
+        <w:t>3. Estructura inicial del proyecto</w:t>
+      </w:r>
+    </w:p>
+    <w:p>
+      <w:pPr>
+        <w:tabs>
+          <w:tab w:val="left" w:pos="9559"/>
+        </w:tabs>
+        <w:rPr>
+          <w:rFonts w:ascii="Arial" w:hAnsi="Arial" w:cs="Arial"/>
+        </w:rPr>
+      </w:pPr>
+      <w:r>
+        <w:rPr>
+          <w:rFonts w:ascii="Arial" w:hAnsi="Arial" w:cs="Arial"/>
+        </w:rPr>
+        <w:t xml:space="preserve">Para desarrollar el sistema organizador de tareas escolares, utilizaremos </w:t>
+      </w:r>
+      <w:proofErr w:type="spellStart"/>
+      <w:r>
+        <w:rPr>
+          <w:rFonts w:ascii="Arial" w:hAnsi="Arial" w:cs="Arial"/>
+        </w:rPr>
+        <w:t>CodeIgniter</w:t>
+      </w:r>
+      <w:proofErr w:type="spellEnd"/>
+      <w:r>
+        <w:rPr>
+          <w:rFonts w:ascii="Arial" w:hAnsi="Arial" w:cs="Arial"/>
+        </w:rPr>
+        <w:t xml:space="preserve"> 4, que nos permitirá mantener el código ordenado y separar las diferentes partes de la aplicación.</w:t>
+      </w:r>
+    </w:p>
+    <w:p>
+      <w:pPr>
+        <w:tabs>
+          <w:tab w:val="left" w:pos="9559"/>
+        </w:tabs>
+        <w:rPr>
+          <w:rFonts w:ascii="Arial" w:hAnsi="Arial" w:cs="Arial"/>
+        </w:rPr>
+      </w:pPr>
+      <w:r>
+        <w:rPr>
+          <w:rFonts w:ascii="Arial" w:hAnsi="Arial" w:cs="Arial"/>
+        </w:rPr>
+        <w:t>El proyecto tendrá la siguiente estructura inicial:</w:t>
+      </w:r>
+    </w:p>
+    <w:p>
+      <w:pPr>
+        <w:tabs>
+          <w:tab w:val="left" w:pos="9559"/>
+        </w:tabs>
+        <w:rPr>
+          <w:rFonts w:ascii="Arial" w:hAnsi="Arial" w:cs="Arial"/>
+        </w:rPr>
+      </w:pPr>
+      <w:r>
+        <w:rPr>
+          <w:rFonts w:ascii="Arial" w:hAnsi="Arial" w:cs="Arial"/>
+        </w:rPr>
+        <w:t>proyecto/</w:t>
+      </w:r>
+    </w:p>
+    <w:p>
+      <w:pPr>
+        <w:tabs>
+          <w:tab w:val="left" w:pos="9559"/>
+        </w:tabs>
+        <w:rPr>
+          <w:rFonts w:ascii="Arial" w:hAnsi="Arial" w:cs="Arial"/>
+        </w:rPr>
+      </w:pPr>
+      <w:r>
+        <w:rPr>
+          <w:rFonts w:ascii="Arial" w:hAnsi="Arial" w:cs="Arial"/>
+        </w:rPr>
+        <w:t xml:space="preserve">├── </w:t>
+      </w:r>
+      <w:proofErr w:type="gramStart"/>
+      <w:r>
+        <w:rPr>
+          <w:rFonts w:ascii="Arial" w:hAnsi="Arial" w:cs="Arial"/>
+        </w:rPr>
+        <w:t>app</w:t>
+      </w:r>
+      <w:proofErr w:type="gramEnd"/>
+      <w:r>
+        <w:rPr>
+          <w:rFonts w:ascii="Arial" w:hAnsi="Arial" w:cs="Arial"/>
+        </w:rPr>
+        <w:t>/</w:t>
+      </w:r>
+    </w:p>
+    <w:p>
+      <w:pPr>
+        <w:tabs>
+          <w:tab w:val="left" w:pos="9559"/>
+        </w:tabs>
+        <w:rPr>
+          <w:rFonts w:ascii="Arial" w:hAnsi="Arial" w:cs="Arial"/>
+        </w:rPr>
+      </w:pPr>
+      <w:r>
+        <w:rPr>
+          <w:rFonts w:ascii="Arial" w:hAnsi="Arial" w:cs="Arial"/>
+        </w:rPr>
+        <w:t xml:space="preserve">│   ├── </w:t>
+      </w:r>
+      <w:proofErr w:type="spellStart"/>
+      <w:r>
+        <w:rPr>
+          <w:rFonts w:ascii="Arial" w:hAnsi="Arial" w:cs="Arial"/>
+        </w:rPr>
+        <w:t>Controllers</w:t>
+      </w:r>
+      <w:proofErr w:type="spellEnd"/>
+      <w:r>
+        <w:rPr>
+          <w:rFonts w:ascii="Arial" w:hAnsi="Arial" w:cs="Arial"/>
+        </w:rPr>
+        <w:t>/</w:t>
+      </w:r>
+    </w:p>
+    <w:p>
+      <w:pPr>
+        <w:tabs>
+          <w:tab w:val="left" w:pos="9559"/>
+        </w:tabs>
+        <w:rPr>
+          <w:rFonts w:ascii="Arial" w:hAnsi="Arial" w:cs="Arial"/>
+        </w:rPr>
+      </w:pPr>
+      <w:r>
+        <w:rPr>
+          <w:rFonts w:ascii="Arial" w:hAnsi="Arial" w:cs="Arial"/>
+        </w:rPr>
+        <w:t xml:space="preserve">│   ├── </w:t>
+      </w:r>
+      <w:proofErr w:type="spellStart"/>
+      <w:r>
+        <w:rPr>
+          <w:rFonts w:ascii="Arial" w:hAnsi="Arial" w:cs="Arial"/>
+        </w:rPr>
+        <w:t>Models</w:t>
+      </w:r>
+      <w:proofErr w:type="spellEnd"/>
+      <w:r>
+        <w:rPr>
+          <w:rFonts w:ascii="Arial" w:hAnsi="Arial" w:cs="Arial"/>
+        </w:rPr>
+        <w:t>/</w:t>
+      </w:r>
+    </w:p>
+    <w:p>
+      <w:pPr>
+        <w:tabs>
+          <w:tab w:val="left" w:pos="9559"/>
+        </w:tabs>
+        <w:rPr>
+          <w:rFonts w:ascii="Arial" w:hAnsi="Arial" w:cs="Arial"/>
+        </w:rPr>
+      </w:pPr>
+      <w:r>
+        <w:rPr>
+          <w:rFonts w:ascii="Arial" w:hAnsi="Arial" w:cs="Arial"/>
+        </w:rPr>
+        <w:t xml:space="preserve">│   ├── </w:t>
+      </w:r>
+      <w:proofErr w:type="spellStart"/>
+      <w:r>
+        <w:rPr>
+          <w:rFonts w:ascii="Arial" w:hAnsi="Arial" w:cs="Arial"/>
+        </w:rPr>
+        <w:t>Views</w:t>
+      </w:r>
+      <w:proofErr w:type="spellEnd"/>
+      <w:r>
+        <w:rPr>
+          <w:rFonts w:ascii="Arial" w:hAnsi="Arial" w:cs="Arial"/>
+        </w:rPr>
+        <w:t>/</w:t>
+      </w:r>
+    </w:p>
+    <w:p>
+      <w:pPr>
+        <w:tabs>
+          <w:tab w:val="left" w:pos="9559"/>
+        </w:tabs>
+        <w:rPr>
+          <w:rFonts w:ascii="Arial" w:hAnsi="Arial" w:cs="Arial"/>
+        </w:rPr>
+      </w:pPr>
+      <w:r>
+        <w:rPr>
+          <w:rFonts w:ascii="Arial" w:hAnsi="Arial" w:cs="Arial"/>
+        </w:rPr>
+        <w:t xml:space="preserve">│   └── </w:t>
+      </w:r>
+      <w:proofErr w:type="spellStart"/>
+      <w:r>
+        <w:rPr>
+          <w:rFonts w:ascii="Arial" w:hAnsi="Arial" w:cs="Arial"/>
+        </w:rPr>
+        <w:t>Config</w:t>
+      </w:r>
+      <w:proofErr w:type="spellEnd"/>
+      <w:r>
+        <w:rPr>
+          <w:rFonts w:ascii="Arial" w:hAnsi="Arial" w:cs="Arial"/>
+        </w:rPr>
+        <w:t>/</w:t>
+      </w:r>
+    </w:p>
+    <w:p>
+      <w:pPr>
+        <w:tabs>
+          <w:tab w:val="left" w:pos="9559"/>
+        </w:tabs>
+        <w:rPr>
+          <w:rFonts w:ascii="Arial" w:hAnsi="Arial" w:cs="Arial"/>
+        </w:rPr>
+      </w:pPr>
+      <w:r>
+        <w:rPr>
+          <w:rFonts w:ascii="Arial" w:hAnsi="Arial" w:cs="Arial"/>
+        </w:rPr>
+        <w:lastRenderedPageBreak/>
+        <w:t xml:space="preserve">├── </w:t>
+      </w:r>
+      <w:proofErr w:type="spellStart"/>
+      <w:r>
+        <w:rPr>
+          <w:rFonts w:ascii="Arial" w:hAnsi="Arial" w:cs="Arial"/>
+        </w:rPr>
+        <w:t>public</w:t>
+      </w:r>
+      <w:proofErr w:type="spellEnd"/>
+      <w:r>
+        <w:rPr>
+          <w:rFonts w:ascii="Arial" w:hAnsi="Arial" w:cs="Arial"/>
+        </w:rPr>
+        <w:t>/</w:t>
+      </w:r>
+    </w:p>
+    <w:p>
+      <w:pPr>
+        <w:tabs>
+          <w:tab w:val="left" w:pos="9559"/>
+        </w:tabs>
+        <w:rPr>
+          <w:rFonts w:ascii="Arial" w:hAnsi="Arial" w:cs="Arial"/>
+        </w:rPr>
+      </w:pPr>
+      <w:r>
+        <w:rPr>
+          <w:rFonts w:ascii="Arial" w:hAnsi="Arial" w:cs="Arial"/>
+        </w:rPr>
+        <w:t xml:space="preserve">├── </w:t>
+      </w:r>
+      <w:proofErr w:type="spellStart"/>
+      <w:r>
+        <w:rPr>
+          <w:rFonts w:ascii="Arial" w:hAnsi="Arial" w:cs="Arial"/>
+        </w:rPr>
+        <w:t>writable</w:t>
+      </w:r>
+      <w:proofErr w:type="spellEnd"/>
+      <w:r>
+        <w:rPr>
+          <w:rFonts w:ascii="Arial" w:hAnsi="Arial" w:cs="Arial"/>
+        </w:rPr>
+        <w:t>/</w:t>
+      </w:r>
+    </w:p>
+    <w:p>
+      <w:pPr>
+        <w:tabs>
+          <w:tab w:val="left" w:pos="9559"/>
+        </w:tabs>
+        <w:rPr>
+          <w:rFonts w:ascii="Arial" w:hAnsi="Arial" w:cs="Arial"/>
+        </w:rPr>
+      </w:pPr>
+      <w:r>
+        <w:rPr>
+          <w:rFonts w:ascii="Arial" w:hAnsi="Arial" w:cs="Arial"/>
+        </w:rPr>
+        <w:t xml:space="preserve">├── </w:t>
+      </w:r>
+      <w:proofErr w:type="spellStart"/>
+      <w:r>
+        <w:rPr>
+          <w:rFonts w:ascii="Arial" w:hAnsi="Arial" w:cs="Arial"/>
+        </w:rPr>
+        <w:t>tests</w:t>
+      </w:r>
+      <w:proofErr w:type="spellEnd"/>
+      <w:r>
+        <w:rPr>
+          <w:rFonts w:ascii="Arial" w:hAnsi="Arial" w:cs="Arial"/>
+        </w:rPr>
+        <w:t>/</w:t>
+      </w:r>
+    </w:p>
+    <w:p>
+      <w:pPr>
+        <w:tabs>
+          <w:tab w:val="left" w:pos="9559"/>
+        </w:tabs>
+        <w:rPr>
+          <w:rFonts w:ascii="Arial" w:hAnsi="Arial" w:cs="Arial"/>
+        </w:rPr>
+      </w:pPr>
+      <w:r>
+        <w:rPr>
+          <w:rFonts w:ascii="Arial" w:hAnsi="Arial" w:cs="Arial"/>
+        </w:rPr>
+        <w:t xml:space="preserve">└── </w:t>
+      </w:r>
+      <w:proofErr w:type="spellStart"/>
+      <w:r>
+        <w:rPr>
+          <w:rFonts w:ascii="Arial" w:hAnsi="Arial" w:cs="Arial"/>
+        </w:rPr>
+        <w:t>spark</w:t>
+      </w:r>
+      <w:proofErr w:type="spellEnd"/>
+    </w:p>
+    <w:p>
+      <w:pPr>
+        <w:tabs>
+          <w:tab w:val="left" w:pos="9559"/>
+        </w:tabs>
+        <w:rPr>
+          <w:rFonts w:ascii="Arial" w:hAnsi="Arial" w:cs="Arial"/>
+        </w:rPr>
+      </w:pPr>
+      <w:r>
+        <w:rPr>
+          <w:rFonts w:ascii="Arial" w:hAnsi="Arial" w:cs="Arial"/>
+        </w:rPr>
+        <w:t xml:space="preserve">Cada carpeta tendrá una función específica. En </w:t>
+      </w:r>
+      <w:proofErr w:type="spellStart"/>
+      <w:r>
+        <w:rPr>
+          <w:rFonts w:ascii="Arial" w:hAnsi="Arial" w:cs="Arial"/>
+        </w:rPr>
+        <w:t>Controllers</w:t>
+      </w:r>
+      <w:proofErr w:type="spellEnd"/>
+      <w:r>
+        <w:rPr>
+          <w:rFonts w:ascii="Arial" w:hAnsi="Arial" w:cs="Arial"/>
+        </w:rPr>
+        <w:t xml:space="preserve"> estará el código encargado de coordinar las acciones del sistema; en </w:t>
+      </w:r>
+      <w:proofErr w:type="spellStart"/>
+      <w:r>
+        <w:rPr>
+          <w:rFonts w:ascii="Arial" w:hAnsi="Arial" w:cs="Arial"/>
+        </w:rPr>
+        <w:t>Models</w:t>
+      </w:r>
+      <w:proofErr w:type="spellEnd"/>
+      <w:r>
+        <w:rPr>
+          <w:rFonts w:ascii="Arial" w:hAnsi="Arial" w:cs="Arial"/>
+        </w:rPr>
+        <w:t xml:space="preserve"> se trabajará con los datos; y en </w:t>
+      </w:r>
+      <w:proofErr w:type="spellStart"/>
+      <w:r>
+        <w:rPr>
+          <w:rFonts w:ascii="Arial" w:hAnsi="Arial" w:cs="Arial"/>
+        </w:rPr>
+        <w:t>Views</w:t>
+      </w:r>
+      <w:proofErr w:type="spellEnd"/>
+      <w:r>
+        <w:rPr>
+          <w:rFonts w:ascii="Arial" w:hAnsi="Arial" w:cs="Arial"/>
+        </w:rPr>
+        <w:t xml:space="preserve"> estarán las pantallas que utilizarán los usuarios. Las demás carpetas servirán para la configuración, los archivos públicos y otras tareas necesarias para el funcionamiento de la aplicación.</w:t>
+      </w:r>
+    </w:p>
+    <w:p>
+      <w:pPr>
+        <w:tabs>
+          <w:tab w:val="left" w:pos="9559"/>
+        </w:tabs>
+        <w:rPr>
+          <w:rFonts w:ascii="Arial" w:hAnsi="Arial" w:cs="Arial"/>
+        </w:rPr>
+      </w:pPr>
+      <w:r>
+        <w:rPr>
+          <w:rFonts w:ascii="Arial" w:hAnsi="Arial" w:cs="Arial"/>
+        </w:rPr>
+        <w:t>Esta será nuestra estructura de partida. Conforme avancemos en el desarrollo, agregaremos los archivos y las carpetas que realmente necesitemos.</w:t>
+      </w:r>
+    </w:p>
+    <w:p>
+      <w:pPr>
+        <w:tabs>
+          <w:tab w:val="left" w:pos="9559"/>
+        </w:tabs>
+        <w:rPr>
+          <w:rFonts w:ascii="Arial" w:hAnsi="Arial" w:cs="Arial"/>
+        </w:rPr>
+      </w:pPr>
+    </w:p>
+    <w:p>
+      <w:pPr>
+        <w:rPr>
+          <w:rFonts w:ascii="Arial" w:hAnsi="Arial" w:cs="Arial"/>
+        </w:rPr>
+      </w:pPr>
+    </w:p>
+    <w:p>
+      <w:pPr>
+        <w:rPr>
+          <w:rFonts w:ascii="Arial" w:hAnsi="Arial" w:cs="Arial"/>
+        </w:rPr>
+      </w:pPr>
+    </w:p>
+    <w:p>
+      <w:pPr>
+        <w:rPr>
+          <w:rFonts w:ascii="Arial" w:hAnsi="Arial" w:cs="Arial"/>
+        </w:rPr>
+      </w:pPr>
+    </w:p>
+    <w:p>
+      <w:pPr>
+        <w:rPr>
+          <w:rFonts w:ascii="Arial" w:hAnsi="Arial" w:cs="Arial"/>
+        </w:rPr>
+      </w:pPr>
+    </w:p>
+    <w:p>
+      <w:pPr>
+        <w:rPr>
+          <w:rFonts w:ascii="Arial" w:hAnsi="Arial" w:cs="Arial"/>
+        </w:rPr>
+      </w:pPr>
+    </w:p>
+    <w:p>
+      <w:pPr>
+        <w:rPr>
+          <w:rFonts w:ascii="Arial" w:hAnsi="Arial" w:cs="Arial"/>
+        </w:rPr>
+      </w:pPr>
+    </w:p>
+    <w:p>
+      <w:pPr>
+        <w:rPr>
+          <w:rFonts w:ascii="Arial" w:hAnsi="Arial" w:cs="Arial"/>
+        </w:rPr>
+      </w:pPr>
+    </w:p>
+    <w:p>
+      <w:pPr>
+        <w:rPr>
+          <w:rFonts w:ascii="Arial" w:hAnsi="Arial" w:cs="Arial"/>
+        </w:rPr>
+      </w:pPr>
+    </w:p>
+    <w:p>
+      <w:pPr>
+        <w:rPr>
+          <w:rFonts w:ascii="Arial" w:hAnsi="Arial" w:cs="Arial"/>
+        </w:rPr>
+      </w:pPr>
+    </w:p>
+    <w:p>
+      <w:pPr>
+        <w:rPr>
+          <w:rFonts w:ascii="Arial" w:hAnsi="Arial" w:cs="Arial"/>
+        </w:rPr>
+      </w:pPr>
+    </w:p>
+    <w:p>
+      <w:pPr>
+        <w:rPr>
+          <w:rFonts w:ascii="Arial" w:hAnsi="Arial" w:cs="Arial"/>
+        </w:rPr>
+      </w:pPr>
+    </w:p>
+    <w:p>
+      <w:pPr>
+        <w:rPr>
+          <w:rFonts w:ascii="Arial" w:hAnsi="Arial" w:cs="Arial"/>
+        </w:rPr>
+      </w:pPr>
+    </w:p>
+    <w:p>
+      <w:pPr>
+        <w:rPr>
+          <w:rFonts w:ascii="Arial" w:hAnsi="Arial" w:cs="Arial"/>
+        </w:rPr>
+      </w:pPr>
     </w:p>
     <w:sectPr>
       <w:pgSz w:w="12240" w:h="15840"/>

</xml_diff>

<commit_message>
Se define entidades y relaciones en base de datos
</commit_message>
<xml_diff>
--- a/Documentacion/analisis.docx
+++ b/Documentacion/analisis.docx
@@ -1444,21 +1444,7 @@
         <w:rPr>
           <w:rFonts w:ascii="Arial" w:hAnsi="Arial" w:cs="Arial"/>
         </w:rPr>
-        <w:t xml:space="preserve">├── </w:t>
-      </w:r>
-      <w:proofErr w:type="gramStart"/>
-      <w:r>
-        <w:rPr>
-          <w:rFonts w:ascii="Arial" w:hAnsi="Arial" w:cs="Arial"/>
-        </w:rPr>
-        <w:t>app</w:t>
-      </w:r>
-      <w:proofErr w:type="gramEnd"/>
-      <w:r>
-        <w:rPr>
-          <w:rFonts w:ascii="Arial" w:hAnsi="Arial" w:cs="Arial"/>
-        </w:rPr>
-        <w:t>/</w:t>
+        <w:t>├── app/</w:t>
       </w:r>
     </w:p>
     <w:p>
@@ -1782,20 +1768,133 @@
     </w:p>
     <w:p>
       <w:pPr>
-        <w:rPr>
-          <w:rFonts w:ascii="Arial" w:hAnsi="Arial" w:cs="Arial"/>
-        </w:rPr>
-      </w:pPr>
-    </w:p>
-    <w:p>
-      <w:pPr>
-        <w:rPr>
-          <w:rFonts w:ascii="Arial" w:hAnsi="Arial" w:cs="Arial"/>
-        </w:rPr>
-      </w:pPr>
-    </w:p>
-    <w:p>
-      <w:pPr>
+        <w:tabs>
+          <w:tab w:val="left" w:pos="9559"/>
+        </w:tabs>
+        <w:rPr>
+          <w:rFonts w:ascii="Arial" w:hAnsi="Arial" w:cs="Arial"/>
+          <w:b/>
+          <w:bCs/>
+        </w:rPr>
+      </w:pPr>
+      <w:r>
+        <w:rPr>
+          <w:rFonts w:ascii="Arial" w:hAnsi="Arial" w:cs="Arial"/>
+          <w:b/>
+          <w:bCs/>
+        </w:rPr>
+        <w:t>4. Base de datos</w:t>
+      </w:r>
+    </w:p>
+    <w:p>
+      <w:pPr>
+        <w:tabs>
+          <w:tab w:val="left" w:pos="9559"/>
+        </w:tabs>
+        <w:rPr>
+          <w:rFonts w:ascii="Arial" w:hAnsi="Arial" w:cs="Arial"/>
+        </w:rPr>
+      </w:pPr>
+      <w:r>
+        <w:rPr>
+          <w:rFonts w:ascii="Arial" w:hAnsi="Arial" w:cs="Arial"/>
+        </w:rPr>
+        <w:t>La base de datos permitirá almacenar y organizar la información necesaria para el funcionamiento del sistema. Antes de comenzar a programar, identificaremos los datos que necesitamos guardar para evitar duplicaciones y facilitar su administración.</w:t>
+      </w:r>
+    </w:p>
+    <w:p>
+      <w:pPr>
+        <w:tabs>
+          <w:tab w:val="left" w:pos="9559"/>
+        </w:tabs>
+        <w:rPr>
+          <w:rFonts w:ascii="Arial" w:hAnsi="Arial" w:cs="Arial"/>
+        </w:rPr>
+      </w:pPr>
+      <w:r>
+        <w:rPr>
+          <w:rFonts w:ascii="Arial" w:hAnsi="Arial" w:cs="Arial"/>
+        </w:rPr>
+        <w:t>Inicialmente, se consideran las siguientes entidades:</w:t>
+      </w:r>
+    </w:p>
+    <w:p>
+      <w:pPr>
+        <w:numPr>
+          <w:ilvl w:val="0"/>
+          <w:numId w:val="6"/>
+        </w:numPr>
+        <w:tabs>
+          <w:tab w:val="left" w:pos="9559"/>
+        </w:tabs>
+        <w:rPr>
+          <w:rFonts w:ascii="Arial" w:hAnsi="Arial" w:cs="Arial"/>
+        </w:rPr>
+      </w:pPr>
+      <w:r>
+        <w:rPr>
+          <w:rFonts w:ascii="Arial" w:hAnsi="Arial" w:cs="Arial"/>
+          <w:b/>
+          <w:bCs/>
+        </w:rPr>
+        <w:t>Usuarios:</w:t>
+      </w:r>
+      <w:r>
+        <w:rPr>
+          <w:rFonts w:ascii="Arial" w:hAnsi="Arial" w:cs="Arial"/>
+        </w:rPr>
+        <w:t xml:space="preserve"> almacenará la información de las personas que utilizarán el sistema, como su nombre, correo electrónico y contraseña.</w:t>
+      </w:r>
+    </w:p>
+    <w:p>
+      <w:pPr>
+        <w:numPr>
+          <w:ilvl w:val="0"/>
+          <w:numId w:val="6"/>
+        </w:numPr>
+        <w:tabs>
+          <w:tab w:val="left" w:pos="9559"/>
+        </w:tabs>
+        <w:rPr>
+          <w:rFonts w:ascii="Arial" w:hAnsi="Arial" w:cs="Arial"/>
+        </w:rPr>
+      </w:pPr>
+      <w:r>
+        <w:rPr>
+          <w:rFonts w:ascii="Arial" w:hAnsi="Arial" w:cs="Arial"/>
+          <w:b/>
+          <w:bCs/>
+        </w:rPr>
+        <w:t>Tareas:</w:t>
+      </w:r>
+      <w:r>
+        <w:rPr>
+          <w:rFonts w:ascii="Arial" w:hAnsi="Arial" w:cs="Arial"/>
+        </w:rPr>
+        <w:t xml:space="preserve"> guardará la información de las tareas escolares, incluyendo su descripción, fecha de entrega y estado.</w:t>
+      </w:r>
+    </w:p>
+    <w:p>
+      <w:pPr>
+        <w:tabs>
+          <w:tab w:val="left" w:pos="9559"/>
+        </w:tabs>
+        <w:rPr>
+          <w:rFonts w:ascii="Arial" w:hAnsi="Arial" w:cs="Arial"/>
+        </w:rPr>
+      </w:pPr>
+      <w:r>
+        <w:rPr>
+          <w:rFonts w:ascii="Arial" w:hAnsi="Arial" w:cs="Arial"/>
+        </w:rPr>
+        <w:t>Estas entidades constituyen una propuesta inicial. Conforme avancemos en el diseño, definiremos los campos necesarios y las relaciones entre ellas, tomando en cuenta los requisitos del proyecto.</w:t>
+      </w:r>
+    </w:p>
+    <w:p>
+      <w:pPr>
+        <w:tabs>
+          <w:tab w:val="left" w:pos="9559"/>
+        </w:tabs>
         <w:rPr>
           <w:rFonts w:ascii="Arial" w:hAnsi="Arial" w:cs="Arial"/>
         </w:rPr>
@@ -2480,6 +2579,155 @@
     </w:lvl>
   </w:abstractNum>
   <w:abstractNum w:abstractNumId="4" w15:restartNumberingAfterBreak="0">
+    <w:nsid w:val="4EE56595"/>
+    <w:multiLevelType w:val="multilevel"/>
+    <w:tmpl w:val="C3BA6F50"/>
+    <w:lvl w:ilvl="0">
+      <w:start w:val="1"/>
+      <w:numFmt w:val="bullet"/>
+      <w:lvlText w:val=""/>
+      <w:lvlJc w:val="left"/>
+      <w:pPr>
+        <w:tabs>
+          <w:tab w:val="num" w:pos="720"/>
+        </w:tabs>
+        <w:ind w:left="720" w:hanging="360"/>
+      </w:pPr>
+      <w:rPr>
+        <w:rFonts w:ascii="Symbol" w:hAnsi="Symbol" w:hint="default"/>
+        <w:sz w:val="20"/>
+      </w:rPr>
+    </w:lvl>
+    <w:lvl w:ilvl="1" w:tentative="1">
+      <w:start w:val="1"/>
+      <w:numFmt w:val="bullet"/>
+      <w:lvlText w:val="o"/>
+      <w:lvlJc w:val="left"/>
+      <w:pPr>
+        <w:tabs>
+          <w:tab w:val="num" w:pos="1440"/>
+        </w:tabs>
+        <w:ind w:left="1440" w:hanging="360"/>
+      </w:pPr>
+      <w:rPr>
+        <w:rFonts w:ascii="Courier New" w:hAnsi="Courier New" w:hint="default"/>
+        <w:sz w:val="20"/>
+      </w:rPr>
+    </w:lvl>
+    <w:lvl w:ilvl="2" w:tentative="1">
+      <w:start w:val="1"/>
+      <w:numFmt w:val="bullet"/>
+      <w:lvlText w:val=""/>
+      <w:lvlJc w:val="left"/>
+      <w:pPr>
+        <w:tabs>
+          <w:tab w:val="num" w:pos="2160"/>
+        </w:tabs>
+        <w:ind w:left="2160" w:hanging="360"/>
+      </w:pPr>
+      <w:rPr>
+        <w:rFonts w:ascii="Wingdings" w:hAnsi="Wingdings" w:hint="default"/>
+        <w:sz w:val="20"/>
+      </w:rPr>
+    </w:lvl>
+    <w:lvl w:ilvl="3" w:tentative="1">
+      <w:start w:val="1"/>
+      <w:numFmt w:val="bullet"/>
+      <w:lvlText w:val=""/>
+      <w:lvlJc w:val="left"/>
+      <w:pPr>
+        <w:tabs>
+          <w:tab w:val="num" w:pos="2880"/>
+        </w:tabs>
+        <w:ind w:left="2880" w:hanging="360"/>
+      </w:pPr>
+      <w:rPr>
+        <w:rFonts w:ascii="Wingdings" w:hAnsi="Wingdings" w:hint="default"/>
+        <w:sz w:val="20"/>
+      </w:rPr>
+    </w:lvl>
+    <w:lvl w:ilvl="4" w:tentative="1">
+      <w:start w:val="1"/>
+      <w:numFmt w:val="bullet"/>
+      <w:lvlText w:val=""/>
+      <w:lvlJc w:val="left"/>
+      <w:pPr>
+        <w:tabs>
+          <w:tab w:val="num" w:pos="3600"/>
+        </w:tabs>
+        <w:ind w:left="3600" w:hanging="360"/>
+      </w:pPr>
+      <w:rPr>
+        <w:rFonts w:ascii="Wingdings" w:hAnsi="Wingdings" w:hint="default"/>
+        <w:sz w:val="20"/>
+      </w:rPr>
+    </w:lvl>
+    <w:lvl w:ilvl="5" w:tentative="1">
+      <w:start w:val="1"/>
+      <w:numFmt w:val="bullet"/>
+      <w:lvlText w:val=""/>
+      <w:lvlJc w:val="left"/>
+      <w:pPr>
+        <w:tabs>
+          <w:tab w:val="num" w:pos="4320"/>
+        </w:tabs>
+        <w:ind w:left="4320" w:hanging="360"/>
+      </w:pPr>
+      <w:rPr>
+        <w:rFonts w:ascii="Wingdings" w:hAnsi="Wingdings" w:hint="default"/>
+        <w:sz w:val="20"/>
+      </w:rPr>
+    </w:lvl>
+    <w:lvl w:ilvl="6" w:tentative="1">
+      <w:start w:val="1"/>
+      <w:numFmt w:val="bullet"/>
+      <w:lvlText w:val=""/>
+      <w:lvlJc w:val="left"/>
+      <w:pPr>
+        <w:tabs>
+          <w:tab w:val="num" w:pos="5040"/>
+        </w:tabs>
+        <w:ind w:left="5040" w:hanging="360"/>
+      </w:pPr>
+      <w:rPr>
+        <w:rFonts w:ascii="Wingdings" w:hAnsi="Wingdings" w:hint="default"/>
+        <w:sz w:val="20"/>
+      </w:rPr>
+    </w:lvl>
+    <w:lvl w:ilvl="7" w:tentative="1">
+      <w:start w:val="1"/>
+      <w:numFmt w:val="bullet"/>
+      <w:lvlText w:val=""/>
+      <w:lvlJc w:val="left"/>
+      <w:pPr>
+        <w:tabs>
+          <w:tab w:val="num" w:pos="5760"/>
+        </w:tabs>
+        <w:ind w:left="5760" w:hanging="360"/>
+      </w:pPr>
+      <w:rPr>
+        <w:rFonts w:ascii="Wingdings" w:hAnsi="Wingdings" w:hint="default"/>
+        <w:sz w:val="20"/>
+      </w:rPr>
+    </w:lvl>
+    <w:lvl w:ilvl="8" w:tentative="1">
+      <w:start w:val="1"/>
+      <w:numFmt w:val="bullet"/>
+      <w:lvlText w:val=""/>
+      <w:lvlJc w:val="left"/>
+      <w:pPr>
+        <w:tabs>
+          <w:tab w:val="num" w:pos="6480"/>
+        </w:tabs>
+        <w:ind w:left="6480" w:hanging="360"/>
+      </w:pPr>
+      <w:rPr>
+        <w:rFonts w:ascii="Wingdings" w:hAnsi="Wingdings" w:hint="default"/>
+        <w:sz w:val="20"/>
+      </w:rPr>
+    </w:lvl>
+  </w:abstractNum>
+  <w:abstractNum w:abstractNumId="5" w15:restartNumberingAfterBreak="0">
     <w:nsid w:val="6A760C14"/>
     <w:multiLevelType w:val="multilevel"/>
     <w:tmpl w:val="19DC4C68"/>
@@ -2629,7 +2877,7 @@
     </w:lvl>
   </w:abstractNum>
   <w:num w:numId="1" w16cid:durableId="1669286953">
-    <w:abstractNumId w:val="4"/>
+    <w:abstractNumId w:val="5"/>
   </w:num>
   <w:num w:numId="2" w16cid:durableId="1133400485">
     <w:abstractNumId w:val="2"/>
@@ -2642,6 +2890,9 @@
   </w:num>
   <w:num w:numId="5" w16cid:durableId="414128420">
     <w:abstractNumId w:val="1"/>
+  </w:num>
+  <w:num w:numId="6" w16cid:durableId="1970235819">
+    <w:abstractNumId w:val="4"/>
   </w:num>
 </w:numbering>
 </file>

</xml_diff>

<commit_message>
Diagrama clases de uso
</commit_message>
<xml_diff>
--- a/Documentacion/analisis.docx
+++ b/Documentacion/analisis.docx
@@ -1444,7 +1444,21 @@
         <w:rPr>
           <w:rFonts w:ascii="Arial" w:hAnsi="Arial" w:cs="Arial"/>
         </w:rPr>
-        <w:t>├── app/</w:t>
+        <w:t xml:space="preserve">├── </w:t>
+      </w:r>
+      <w:proofErr w:type="gramStart"/>
+      <w:r>
+        <w:rPr>
+          <w:rFonts w:ascii="Arial" w:hAnsi="Arial" w:cs="Arial"/>
+        </w:rPr>
+        <w:t>app</w:t>
+      </w:r>
+      <w:proofErr w:type="gramEnd"/>
+      <w:r>
+        <w:rPr>
+          <w:rFonts w:ascii="Arial" w:hAnsi="Arial" w:cs="Arial"/>
+        </w:rPr>
+        <w:t>/</w:t>
       </w:r>
     </w:p>
     <w:p>
@@ -1887,8 +1901,110 @@
         <w:rPr>
           <w:rFonts w:ascii="Arial" w:hAnsi="Arial" w:cs="Arial"/>
         </w:rPr>
+        <w:drawing>
+          <wp:anchor distT="0" distB="0" distL="114300" distR="114300" simplePos="0" relativeHeight="251661312" behindDoc="0" locked="0" layoutInCell="1" allowOverlap="1" wp14:anchorId="6D489749" wp14:editId="37CA1187">
+            <wp:simplePos x="0" y="0"/>
+            <wp:positionH relativeFrom="column">
+              <wp:posOffset>425297</wp:posOffset>
+            </wp:positionH>
+            <wp:positionV relativeFrom="paragraph">
+              <wp:posOffset>581879</wp:posOffset>
+            </wp:positionV>
+            <wp:extent cx="5297170" cy="3280410"/>
+            <wp:effectExtent l="0" t="0" r="0" b="0"/>
+            <wp:wrapTopAndBottom/>
+            <wp:docPr id="381421095" name="Imagen 4"/>
+            <wp:cNvGraphicFramePr>
+              <a:graphicFrameLocks xmlns:a="http://schemas.openxmlformats.org/drawingml/2006/main" noChangeAspect="1"/>
+            </wp:cNvGraphicFramePr>
+            <a:graphic xmlns:a="http://schemas.openxmlformats.org/drawingml/2006/main">
+              <a:graphicData uri="http://schemas.openxmlformats.org/drawingml/2006/picture">
+                <pic:pic xmlns:pic="http://schemas.openxmlformats.org/drawingml/2006/picture">
+                  <pic:nvPicPr>
+                    <pic:cNvPr id="0" name="Picture 13"/>
+                    <pic:cNvPicPr>
+                      <a:picLocks noChangeAspect="1" noChangeArrowheads="1"/>
+                    </pic:cNvPicPr>
+                  </pic:nvPicPr>
+                  <pic:blipFill rotWithShape="1">
+                    <a:blip r:embed="rId8">
+                      <a:extLst>
+                        <a:ext uri="{28A0092B-C50C-407E-A947-70E740481C1C}">
+                          <a14:useLocalDpi xmlns:a14="http://schemas.microsoft.com/office/drawing/2010/main" val="0"/>
+                        </a:ext>
+                      </a:extLst>
+                    </a:blip>
+                    <a:srcRect t="26412"/>
+                    <a:stretch>
+                      <a:fillRect/>
+                    </a:stretch>
+                  </pic:blipFill>
+                  <pic:spPr bwMode="auto">
+                    <a:xfrm>
+                      <a:off x="0" y="0"/>
+                      <a:ext cx="5297170" cy="3280410"/>
+                    </a:xfrm>
+                    <a:prstGeom prst="rect">
+                      <a:avLst/>
+                    </a:prstGeom>
+                    <a:noFill/>
+                    <a:ln>
+                      <a:noFill/>
+                    </a:ln>
+                    <a:extLst>
+                      <a:ext uri="{53640926-AAD7-44D8-BBD7-CCE9431645EC}">
+                        <a14:shadowObscured xmlns:a14="http://schemas.microsoft.com/office/drawing/2010/main"/>
+                      </a:ext>
+                    </a:extLst>
+                  </pic:spPr>
+                </pic:pic>
+              </a:graphicData>
+            </a:graphic>
+            <wp14:sizeRelH relativeFrom="margin">
+              <wp14:pctWidth>0</wp14:pctWidth>
+            </wp14:sizeRelH>
+            <wp14:sizeRelV relativeFrom="margin">
+              <wp14:pctHeight>0</wp14:pctHeight>
+            </wp14:sizeRelV>
+          </wp:anchor>
+        </w:drawing>
+      </w:r>
+      <w:r>
+        <w:rPr>
+          <w:rFonts w:ascii="Arial" w:hAnsi="Arial" w:cs="Arial"/>
+        </w:rPr>
         <w:t>Estas entidades constituyen una propuesta inicial. Conforme avancemos en el diseño, definiremos los campos necesarios y las relaciones entre ellas, tomando en cuenta los requisitos del proyecto.</w:t>
       </w:r>
+    </w:p>
+    <w:p>
+      <w:pPr>
+        <w:tabs>
+          <w:tab w:val="left" w:pos="9559"/>
+        </w:tabs>
+        <w:rPr>
+          <w:rFonts w:ascii="Arial" w:hAnsi="Arial" w:cs="Arial"/>
+        </w:rPr>
+      </w:pPr>
+    </w:p>
+    <w:p>
+      <w:pPr>
+        <w:tabs>
+          <w:tab w:val="left" w:pos="9559"/>
+        </w:tabs>
+        <w:rPr>
+          <w:rFonts w:ascii="Arial" w:hAnsi="Arial" w:cs="Arial"/>
+        </w:rPr>
+      </w:pPr>
+    </w:p>
+    <w:p>
+      <w:pPr>
+        <w:tabs>
+          <w:tab w:val="left" w:pos="9559"/>
+        </w:tabs>
+        <w:rPr>
+          <w:rFonts w:ascii="Arial" w:hAnsi="Arial" w:cs="Arial"/>
+        </w:rPr>
+      </w:pPr>
     </w:p>
     <w:p>
       <w:pPr>

</xml_diff>